<commit_message>
Actualizacion evidencias individuales Pablo
</commit_message>
<xml_diff>
--- a/Fase 1/Evidencias Individuales/Gutierrez_Pablo_1.2_APT122_DiarioReflexionFase1.docx
+++ b/Fase 1/Evidencias Individuales/Gutierrez_Pablo_1.2_APT122_DiarioReflexionFase1.docx
@@ -1,6 +1,6 @@
 
 <file path=word/document.xml><?xml version="1.0" encoding="utf-8"?>
-<w:document xmlns:wpc="http://schemas.microsoft.com/office/word/2010/wordprocessingCanvas" xmlns:cx="http://schemas.microsoft.com/office/drawing/2014/chartex" xmlns:mc="http://schemas.openxmlformats.org/markup-compatibility/2006" xmlns:o="urn:schemas-microsoft-com:office:office" xmlns:r="http://schemas.openxmlformats.org/officeDocument/2006/relationships" xmlns:m="http://schemas.openxmlformats.org/officeDocument/2006/math" xmlns:v="urn:schemas-microsoft-com:vml" xmlns:wp14="http://schemas.microsoft.com/office/word/2010/wordprocessingDrawing" xmlns:wp="http://schemas.openxmlformats.org/drawingml/2006/wordprocessingDrawing" xmlns:w10="urn:schemas-microsoft-com:office:word" xmlns:w="http://schemas.openxmlformats.org/wordprocessingml/2006/main" xmlns:w14="http://schemas.microsoft.com/office/word/2010/wordml" xmlns:w15="http://schemas.microsoft.com/office/word/2012/wordml" xmlns:w16se="http://schemas.microsoft.com/office/word/2015/wordml/symex" xmlns:wpg="http://schemas.microsoft.com/office/word/2010/wordprocessingGroup" xmlns:wpi="http://schemas.microsoft.com/office/word/2010/wordprocessingInk" xmlns:wne="http://schemas.microsoft.com/office/word/2006/wordml" xmlns:wps="http://schemas.microsoft.com/office/word/2010/wordprocessingShape" mc:Ignorable="w14 w15 w16se wp14">
+<w:document xmlns:wpc="http://schemas.microsoft.com/office/word/2010/wordprocessingCanvas" xmlns:cx="http://schemas.microsoft.com/office/drawing/2014/chartex" xmlns:cx1="http://schemas.microsoft.com/office/drawing/2015/9/8/chartex" xmlns:cx2="http://schemas.microsoft.com/office/drawing/2015/10/21/chartex" xmlns:cx3="http://schemas.microsoft.com/office/drawing/2016/5/9/chartex" xmlns:cx4="http://schemas.microsoft.com/office/drawing/2016/5/10/chartex" xmlns:cx5="http://schemas.microsoft.com/office/drawing/2016/5/11/chartex" xmlns:cx6="http://schemas.microsoft.com/office/drawing/2016/5/12/chartex" xmlns:cx7="http://schemas.microsoft.com/office/drawing/2016/5/13/chartex" xmlns:cx8="http://schemas.microsoft.com/office/drawing/2016/5/14/chartex" xmlns:mc="http://schemas.openxmlformats.org/markup-compatibility/2006" xmlns:aink="http://schemas.microsoft.com/office/drawing/2016/ink" xmlns:am3d="http://schemas.microsoft.com/office/drawing/2017/model3d" xmlns:o="urn:schemas-microsoft-com:office:office" xmlns:oel="http://schemas.microsoft.com/office/2019/extlst" xmlns:r="http://schemas.openxmlformats.org/officeDocument/2006/relationships" xmlns:m="http://schemas.openxmlformats.org/officeDocument/2006/math" xmlns:v="urn:schemas-microsoft-com:vml" xmlns:wp14="http://schemas.microsoft.com/office/word/2010/wordprocessingDrawing" xmlns:wp="http://schemas.openxmlformats.org/drawingml/2006/wordprocessingDrawing" xmlns:w10="urn:schemas-microsoft-com:office:word" xmlns:w="http://schemas.openxmlformats.org/wordprocessingml/2006/main" xmlns:w14="http://schemas.microsoft.com/office/word/2010/wordml" xmlns:w15="http://schemas.microsoft.com/office/word/2012/wordml" xmlns:w16cex="http://schemas.microsoft.com/office/word/2018/wordml/cex" xmlns:w16cid="http://schemas.microsoft.com/office/word/2016/wordml/cid" xmlns:w16="http://schemas.microsoft.com/office/word/2018/wordml" xmlns:w16du="http://schemas.microsoft.com/office/word/2023/wordml/word16du" xmlns:w16sdtdh="http://schemas.microsoft.com/office/word/2020/wordml/sdtdatahash" xmlns:w16sdtfl="http://schemas.microsoft.com/office/word/2024/wordml/sdtformatlock" xmlns:w16se="http://schemas.microsoft.com/office/word/2015/wordml/symex" xmlns:wpg="http://schemas.microsoft.com/office/word/2010/wordprocessingGroup" xmlns:wpi="http://schemas.microsoft.com/office/word/2010/wordprocessingInk" xmlns:wne="http://schemas.microsoft.com/office/word/2006/wordml" xmlns:wps="http://schemas.microsoft.com/office/word/2010/wordprocessingShape" mc:Ignorable="w14 w15 w16se w16cid w16 w16cex w16sdtdh w16sdtfl w16du wp14">
   <w:body>
     <w:p/>
     <w:tbl>
@@ -369,6 +369,15 @@
                 <w:szCs w:val="24"/>
               </w:rPr>
             </w:pPr>
+            <w:r>
+              <w:rPr>
+                <w:rFonts w:eastAsiaTheme="majorEastAsia"/>
+                <w:color w:val="767171" w:themeColor="background2" w:themeShade="80"/>
+                <w:sz w:val="24"/>
+                <w:szCs w:val="24"/>
+              </w:rPr>
+              <w:t>En general, las asignaturas que más disfruté fueron las de carácter técnico, sobre todo las relacionadas con bases de datos, programación, business intelligence y big data. El hecho de poder construir una solución técnica desde cero, o poder mejorar una ya existente, siempre me ha motivado, el poder desarrollar, probar, y lograr que funcione es un estímulo que me ha llevado a estar terminando esta carrera.</w:t>
+            </w:r>
           </w:p>
           <w:p>
             <w:pPr>
@@ -451,6 +460,60 @@
                 <w:szCs w:val="24"/>
               </w:rPr>
             </w:pPr>
+            <w:r>
+              <w:rPr>
+                <w:rFonts w:eastAsiaTheme="majorEastAsia"/>
+                <w:color w:val="767171" w:themeColor="background2" w:themeShade="80"/>
+                <w:sz w:val="24"/>
+                <w:szCs w:val="24"/>
+              </w:rPr>
+              <w:t xml:space="preserve">Las certificaciones obtenidas me han permitido reforzar los conocimientos adquiridos a lo largo de mi carrera, con la libertad de poder elegir las áreas que son de mi interés. Además, han sido una gran ventaja para </w:t>
+            </w:r>
+            <w:r>
+              <w:rPr>
+                <w:rFonts w:eastAsiaTheme="majorEastAsia"/>
+                <w:color w:val="767171" w:themeColor="background2" w:themeShade="80"/>
+                <w:sz w:val="24"/>
+                <w:szCs w:val="24"/>
+              </w:rPr>
+              <w:t>mí</w:t>
+            </w:r>
+            <w:r>
+              <w:rPr>
+                <w:rFonts w:eastAsiaTheme="majorEastAsia"/>
+                <w:color w:val="767171" w:themeColor="background2" w:themeShade="80"/>
+                <w:sz w:val="24"/>
+                <w:szCs w:val="24"/>
+              </w:rPr>
+              <w:t xml:space="preserve"> en lo </w:t>
+            </w:r>
+            <w:r>
+              <w:rPr>
+                <w:rFonts w:eastAsiaTheme="majorEastAsia"/>
+                <w:color w:val="767171" w:themeColor="background2" w:themeShade="80"/>
+                <w:sz w:val="24"/>
+                <w:szCs w:val="24"/>
+              </w:rPr>
+              <w:t xml:space="preserve">laboral, he podido </w:t>
+            </w:r>
+            <w:r>
+              <w:rPr>
+                <w:rFonts w:eastAsiaTheme="majorEastAsia"/>
+                <w:color w:val="767171" w:themeColor="background2" w:themeShade="80"/>
+                <w:sz w:val="24"/>
+                <w:szCs w:val="24"/>
+              </w:rPr>
+              <w:t>optar a mayores responsabilidades y reconocimiento por parte de mis superiores.</w:t>
+            </w:r>
+            <w:r>
+              <w:rPr>
+                <w:rFonts w:eastAsiaTheme="majorEastAsia"/>
+                <w:color w:val="767171" w:themeColor="background2" w:themeShade="80"/>
+                <w:sz w:val="24"/>
+                <w:szCs w:val="24"/>
+              </w:rPr>
+              <w:t xml:space="preserve"> No hay duda de que las certificaciones aportan valor a mi carrera.</w:t>
+            </w:r>
           </w:p>
           <w:p>
             <w:pPr>
@@ -641,7 +704,6 @@
                 <w:sz w:val="24"/>
                 <w:szCs w:val="24"/>
               </w:rPr>
-              <w:lastRenderedPageBreak/>
               <w:t xml:space="preserve">2. Revisa las competencias y unidades de competencias correspondientes a cada asignatura de la malla de tu carrera. Marca en </w:t>
             </w:r>
             <w:r>
@@ -798,6 +860,15 @@
                 <w:szCs w:val="24"/>
               </w:rPr>
             </w:pPr>
+            <w:r>
+              <w:rPr>
+                <w:rFonts w:eastAsiaTheme="majorEastAsia"/>
+                <w:color w:val="767171" w:themeColor="background2" w:themeShade="80"/>
+                <w:sz w:val="24"/>
+                <w:szCs w:val="24"/>
+              </w:rPr>
+              <w:t>Creo que mis fortalezas van por el lado del desarrollo, principalmente desde el punto de vista técnico. Como mencioné anteriormente, es lo que me ha movido o motivado a estudiar esta carrera y estar ya en etapas finales de esta. A pesar de esto, creo que también tengo algunas habilidades blandas que me han permitido desenvolverme de buena manera a la hora de tratar con clientes, ya sea comprendiendo requerimientos, dando respuesta a inquietudes o solicitudes, entre otras.</w:t>
+            </w:r>
           </w:p>
           <w:p>
             <w:pPr>
@@ -826,6 +897,15 @@
                 <w:szCs w:val="24"/>
               </w:rPr>
             </w:pPr>
+            <w:r>
+              <w:rPr>
+                <w:rFonts w:eastAsiaTheme="majorEastAsia"/>
+                <w:color w:val="767171" w:themeColor="background2" w:themeShade="80"/>
+                <w:sz w:val="24"/>
+                <w:szCs w:val="24"/>
+              </w:rPr>
+              <w:t>En cuanto a las áreas que debo reforzar, sin duda van por el lado de la gestión de proyectos, principalmente la documentación, ya que suelen ser tareas que considero tediosas, sin embargo, a lo largo de la carrera he podido reconocer el valor y la importancia que tienen a la hora de emprender un proyecto, no solo de tipo informático, sino de cualquier naturaleza.</w:t>
+            </w:r>
           </w:p>
           <w:p>
             <w:pPr>
@@ -902,44 +982,12 @@
               <w:tabs>
                 <w:tab w:val="left" w:pos="454"/>
               </w:tabs>
-              <w:ind w:left="171"/>
               <w:jc w:val="both"/>
               <w:rPr>
                 <w:rFonts w:eastAsiaTheme="majorEastAsia"/>
                 <w:color w:val="767171" w:themeColor="background2" w:themeShade="80"/>
                 <w:sz w:val="24"/>
                 <w:szCs w:val="24"/>
-              </w:rPr>
-            </w:pPr>
-          </w:p>
-          <w:p>
-            <w:pPr>
-              <w:jc w:val="both"/>
-              <w:rPr>
-                <w:rFonts w:eastAsiaTheme="majorEastAsia"/>
-                <w:color w:val="767171" w:themeColor="background2" w:themeShade="80"/>
-                <w:sz w:val="24"/>
-                <w:szCs w:val="24"/>
-              </w:rPr>
-            </w:pPr>
-          </w:p>
-          <w:p>
-            <w:pPr>
-              <w:jc w:val="both"/>
-              <w:rPr>
-                <w:rFonts w:ascii="Calibri" w:hAnsi="Calibri"/>
-                <w:b/>
-                <w:bCs/>
-              </w:rPr>
-            </w:pPr>
-          </w:p>
-          <w:p>
-            <w:pPr>
-              <w:jc w:val="both"/>
-              <w:rPr>
-                <w:rFonts w:ascii="Calibri" w:hAnsi="Calibri"/>
-                <w:b/>
-                <w:bCs/>
               </w:rPr>
             </w:pPr>
           </w:p>
@@ -1242,62 +1290,15 @@
                 <w:szCs w:val="24"/>
               </w:rPr>
             </w:pPr>
-          </w:p>
-          <w:p>
-            <w:pPr>
-              <w:tabs>
-                <w:tab w:val="left" w:pos="454"/>
-              </w:tabs>
-              <w:jc w:val="both"/>
+            <w:r>
               <w:rPr>
                 <w:rFonts w:eastAsiaTheme="majorEastAsia"/>
                 <w:color w:val="767171" w:themeColor="background2" w:themeShade="80"/>
                 <w:sz w:val="24"/>
                 <w:szCs w:val="24"/>
               </w:rPr>
-            </w:pPr>
-          </w:p>
-          <w:p>
-            <w:pPr>
-              <w:tabs>
-                <w:tab w:val="left" w:pos="454"/>
-              </w:tabs>
-              <w:jc w:val="both"/>
-              <w:rPr>
-                <w:rFonts w:eastAsiaTheme="majorEastAsia"/>
-                <w:color w:val="767171" w:themeColor="background2" w:themeShade="80"/>
-                <w:sz w:val="24"/>
-                <w:szCs w:val="24"/>
-              </w:rPr>
-            </w:pPr>
-          </w:p>
-          <w:p>
-            <w:pPr>
-              <w:tabs>
-                <w:tab w:val="left" w:pos="454"/>
-              </w:tabs>
-              <w:jc w:val="both"/>
-              <w:rPr>
-                <w:rFonts w:eastAsiaTheme="majorEastAsia"/>
-                <w:color w:val="767171" w:themeColor="background2" w:themeShade="80"/>
-                <w:sz w:val="24"/>
-                <w:szCs w:val="24"/>
-              </w:rPr>
-            </w:pPr>
-          </w:p>
-          <w:p>
-            <w:pPr>
-              <w:tabs>
-                <w:tab w:val="left" w:pos="454"/>
-              </w:tabs>
-              <w:jc w:val="both"/>
-              <w:rPr>
-                <w:rFonts w:eastAsiaTheme="majorEastAsia"/>
-                <w:color w:val="767171" w:themeColor="background2" w:themeShade="80"/>
-                <w:sz w:val="24"/>
-                <w:szCs w:val="24"/>
-              </w:rPr>
-            </w:pPr>
+              <w:t>Profesionalmente, me interesa el desarrollo de software, aunque por asuntos laborales, he debido desempeñarme en el campo de la consultoría, que es bastante dinámico. He logrado “tomarle el gusto” a esta experiencia. También me gustaría en algún momento participar en proyectos de datos.</w:t>
+            </w:r>
           </w:p>
           <w:p>
             <w:pPr>
@@ -1368,76 +1369,15 @@
                 <w:szCs w:val="24"/>
               </w:rPr>
             </w:pPr>
-          </w:p>
-          <w:p>
-            <w:pPr>
-              <w:tabs>
-                <w:tab w:val="left" w:pos="454"/>
-              </w:tabs>
-              <w:jc w:val="both"/>
+            <w:r>
               <w:rPr>
                 <w:rFonts w:eastAsiaTheme="majorEastAsia"/>
                 <w:color w:val="767171" w:themeColor="background2" w:themeShade="80"/>
                 <w:sz w:val="24"/>
                 <w:szCs w:val="24"/>
               </w:rPr>
-            </w:pPr>
-          </w:p>
-          <w:p>
-            <w:pPr>
-              <w:tabs>
-                <w:tab w:val="left" w:pos="454"/>
-              </w:tabs>
-              <w:jc w:val="both"/>
-              <w:rPr>
-                <w:rFonts w:eastAsiaTheme="majorEastAsia"/>
-                <w:color w:val="767171" w:themeColor="background2" w:themeShade="80"/>
-                <w:sz w:val="24"/>
-                <w:szCs w:val="24"/>
-              </w:rPr>
-            </w:pPr>
-          </w:p>
-          <w:p>
-            <w:pPr>
-              <w:tabs>
-                <w:tab w:val="left" w:pos="454"/>
-              </w:tabs>
-              <w:jc w:val="both"/>
-              <w:rPr>
-                <w:rFonts w:eastAsiaTheme="majorEastAsia"/>
-                <w:color w:val="767171" w:themeColor="background2" w:themeShade="80"/>
-                <w:sz w:val="24"/>
-                <w:szCs w:val="24"/>
-              </w:rPr>
-            </w:pPr>
-          </w:p>
-          <w:p>
-            <w:pPr>
-              <w:tabs>
-                <w:tab w:val="left" w:pos="454"/>
-              </w:tabs>
-              <w:jc w:val="both"/>
-              <w:rPr>
-                <w:rFonts w:eastAsiaTheme="majorEastAsia"/>
-                <w:color w:val="767171" w:themeColor="background2" w:themeShade="80"/>
-                <w:sz w:val="24"/>
-                <w:szCs w:val="24"/>
-              </w:rPr>
-            </w:pPr>
-          </w:p>
-          <w:p>
-            <w:pPr>
-              <w:tabs>
-                <w:tab w:val="left" w:pos="454"/>
-              </w:tabs>
-              <w:jc w:val="both"/>
-              <w:rPr>
-                <w:rFonts w:eastAsiaTheme="majorEastAsia"/>
-                <w:color w:val="767171" w:themeColor="background2" w:themeShade="80"/>
-                <w:sz w:val="24"/>
-                <w:szCs w:val="24"/>
-              </w:rPr>
-            </w:pPr>
+              <w:t>Creo que las competencias relacionadas con lo técnico son las que más se relacionan con mis intereses profesionales. Sin embargo, he aprendido que en este rubro hay que estar en constante actualización, ya que la tecnología avanza a paso acelerado. Por ejemplo, desde el ingreso a la carrera en 2023 hemos sido testigos de un crecimiento exponencial de las herramientas de inteligencia artificial. Pretender ignorarlo es simplemente quedar obsoleto. Por lo mismo, mis esfuerzos apuntan actualmente a actualizarme en estas tecnologías, por medio de certificaciones, e incorporando estas herramientas al trabajo diario.</w:t>
+            </w:r>
           </w:p>
           <w:p>
             <w:pPr>
@@ -1508,6 +1448,42 @@
                 <w:szCs w:val="24"/>
               </w:rPr>
             </w:pPr>
+            <w:r>
+              <w:rPr>
+                <w:rFonts w:eastAsiaTheme="majorEastAsia"/>
+                <w:color w:val="767171" w:themeColor="background2" w:themeShade="80"/>
+                <w:sz w:val="24"/>
+                <w:szCs w:val="24"/>
+              </w:rPr>
+              <w:t>Me gustaría estar en un puesto Senior, que me permita tener estabilidad laboral y financiera. Además, me gustaría poder entregar conocimiento a nuevas generaciones. Descarto la opción de hacer clases, per</w:t>
+            </w:r>
+            <w:r>
+              <w:rPr>
+                <w:rFonts w:eastAsiaTheme="majorEastAsia"/>
+                <w:color w:val="767171" w:themeColor="background2" w:themeShade="80"/>
+                <w:sz w:val="24"/>
+                <w:szCs w:val="24"/>
+              </w:rPr>
+              <w:t xml:space="preserve">o </w:t>
+            </w:r>
+            <w:r>
+              <w:rPr>
+                <w:rFonts w:eastAsiaTheme="majorEastAsia"/>
+                <w:color w:val="767171" w:themeColor="background2" w:themeShade="80"/>
+                <w:sz w:val="24"/>
+                <w:szCs w:val="24"/>
+              </w:rPr>
+              <w:t>no es la única</w:t>
+            </w:r>
+            <w:r>
+              <w:rPr>
+                <w:rFonts w:eastAsiaTheme="majorEastAsia"/>
+                <w:color w:val="767171" w:themeColor="background2" w:themeShade="80"/>
+                <w:sz w:val="24"/>
+                <w:szCs w:val="24"/>
+              </w:rPr>
+              <w:t xml:space="preserve"> alternativa.</w:t>
+            </w:r>
           </w:p>
           <w:p>
             <w:pPr>
@@ -1743,8 +1719,6 @@
                 <w:szCs w:val="20"/>
               </w:rPr>
             </w:pPr>
-            <w:bookmarkStart w:id="0" w:name="_GoBack"/>
-            <w:bookmarkEnd w:id="0"/>
             <w:r>
               <w:rPr>
                 <w:rFonts w:eastAsiaTheme="majorEastAsia"/>
@@ -1831,6 +1805,15 @@
                 <w:szCs w:val="24"/>
               </w:rPr>
             </w:pPr>
+            <w:r>
+              <w:rPr>
+                <w:rFonts w:eastAsiaTheme="majorEastAsia"/>
+                <w:color w:val="767171" w:themeColor="background2" w:themeShade="80"/>
+                <w:sz w:val="24"/>
+                <w:szCs w:val="24"/>
+              </w:rPr>
+              <w:t>La verdad es que el trabajo desarrollado previamente me ha servido para afrontar de mejor manera esta última etapa del proceso, pero por distintos motivos, no son proyectos que podría desarrollar y ejecutar actualmente. A pesar de eso, por supuesto que se relacionan con mis proyecciones profesionales, ya que han surgido del interés relacionado a esa proyección.</w:t>
+            </w:r>
           </w:p>
           <w:p>
             <w:pPr>
@@ -1855,45 +1838,6 @@
               <w:rPr>
                 <w:rFonts w:eastAsiaTheme="majorEastAsia"/>
                 <w:color w:val="767171" w:themeColor="background2" w:themeShade="80"/>
-                <w:sz w:val="24"/>
-                <w:szCs w:val="24"/>
-              </w:rPr>
-            </w:pPr>
-          </w:p>
-          <w:p>
-            <w:pPr>
-              <w:tabs>
-                <w:tab w:val="left" w:pos="454"/>
-              </w:tabs>
-              <w:jc w:val="both"/>
-              <w:rPr>
-                <w:rFonts w:eastAsiaTheme="majorEastAsia"/>
-                <w:sz w:val="24"/>
-                <w:szCs w:val="24"/>
-              </w:rPr>
-            </w:pPr>
-          </w:p>
-          <w:p>
-            <w:pPr>
-              <w:tabs>
-                <w:tab w:val="left" w:pos="454"/>
-              </w:tabs>
-              <w:jc w:val="both"/>
-              <w:rPr>
-                <w:rFonts w:eastAsiaTheme="majorEastAsia"/>
-                <w:sz w:val="24"/>
-                <w:szCs w:val="24"/>
-              </w:rPr>
-            </w:pPr>
-          </w:p>
-          <w:p>
-            <w:pPr>
-              <w:tabs>
-                <w:tab w:val="left" w:pos="454"/>
-              </w:tabs>
-              <w:jc w:val="both"/>
-              <w:rPr>
-                <w:rFonts w:eastAsiaTheme="majorEastAsia"/>
                 <w:sz w:val="24"/>
                 <w:szCs w:val="24"/>
               </w:rPr>
@@ -2213,7 +2157,7 @@
 </file>
 
 <file path=word/endnotes.xml><?xml version="1.0" encoding="utf-8"?>
-<w:endnotes xmlns:wpc="http://schemas.microsoft.com/office/word/2010/wordprocessingCanvas" xmlns:cx="http://schemas.microsoft.com/office/drawing/2014/chartex" xmlns:mc="http://schemas.openxmlformats.org/markup-compatibility/2006" xmlns:o="urn:schemas-microsoft-com:office:office" xmlns:r="http://schemas.openxmlformats.org/officeDocument/2006/relationships" xmlns:m="http://schemas.openxmlformats.org/officeDocument/2006/math" xmlns:v="urn:schemas-microsoft-com:vml" xmlns:wp14="http://schemas.microsoft.com/office/word/2010/wordprocessingDrawing" xmlns:wp="http://schemas.openxmlformats.org/drawingml/2006/wordprocessingDrawing" xmlns:w10="urn:schemas-microsoft-com:office:word" xmlns:w="http://schemas.openxmlformats.org/wordprocessingml/2006/main" xmlns:w14="http://schemas.microsoft.com/office/word/2010/wordml" xmlns:w15="http://schemas.microsoft.com/office/word/2012/wordml" xmlns:w16se="http://schemas.microsoft.com/office/word/2015/wordml/symex" xmlns:wpg="http://schemas.microsoft.com/office/word/2010/wordprocessingGroup" xmlns:wpi="http://schemas.microsoft.com/office/word/2010/wordprocessingInk" xmlns:wne="http://schemas.microsoft.com/office/word/2006/wordml" xmlns:wps="http://schemas.microsoft.com/office/word/2010/wordprocessingShape" mc:Ignorable="w14 w15 w16se wp14">
+<w:endnotes xmlns:wpc="http://schemas.microsoft.com/office/word/2010/wordprocessingCanvas" xmlns:cx="http://schemas.microsoft.com/office/drawing/2014/chartex" xmlns:cx1="http://schemas.microsoft.com/office/drawing/2015/9/8/chartex" xmlns:cx2="http://schemas.microsoft.com/office/drawing/2015/10/21/chartex" xmlns:cx3="http://schemas.microsoft.com/office/drawing/2016/5/9/chartex" xmlns:cx4="http://schemas.microsoft.com/office/drawing/2016/5/10/chartex" xmlns:cx5="http://schemas.microsoft.com/office/drawing/2016/5/11/chartex" xmlns:cx6="http://schemas.microsoft.com/office/drawing/2016/5/12/chartex" xmlns:cx7="http://schemas.microsoft.com/office/drawing/2016/5/13/chartex" xmlns:cx8="http://schemas.microsoft.com/office/drawing/2016/5/14/chartex" xmlns:mc="http://schemas.openxmlformats.org/markup-compatibility/2006" xmlns:aink="http://schemas.microsoft.com/office/drawing/2016/ink" xmlns:am3d="http://schemas.microsoft.com/office/drawing/2017/model3d" xmlns:o="urn:schemas-microsoft-com:office:office" xmlns:oel="http://schemas.microsoft.com/office/2019/extlst" xmlns:r="http://schemas.openxmlformats.org/officeDocument/2006/relationships" xmlns:m="http://schemas.openxmlformats.org/officeDocument/2006/math" xmlns:v="urn:schemas-microsoft-com:vml" xmlns:wp14="http://schemas.microsoft.com/office/word/2010/wordprocessingDrawing" xmlns:wp="http://schemas.openxmlformats.org/drawingml/2006/wordprocessingDrawing" xmlns:w10="urn:schemas-microsoft-com:office:word" xmlns:w="http://schemas.openxmlformats.org/wordprocessingml/2006/main" xmlns:w14="http://schemas.microsoft.com/office/word/2010/wordml" xmlns:w15="http://schemas.microsoft.com/office/word/2012/wordml" xmlns:w16cex="http://schemas.microsoft.com/office/word/2018/wordml/cex" xmlns:w16cid="http://schemas.microsoft.com/office/word/2016/wordml/cid" xmlns:w16="http://schemas.microsoft.com/office/word/2018/wordml" xmlns:w16du="http://schemas.microsoft.com/office/word/2023/wordml/word16du" xmlns:w16sdtdh="http://schemas.microsoft.com/office/word/2020/wordml/sdtdatahash" xmlns:w16sdtfl="http://schemas.microsoft.com/office/word/2024/wordml/sdtformatlock" xmlns:w16se="http://schemas.microsoft.com/office/word/2015/wordml/symex" xmlns:wpg="http://schemas.microsoft.com/office/word/2010/wordprocessingGroup" xmlns:wpi="http://schemas.microsoft.com/office/word/2010/wordprocessingInk" xmlns:wne="http://schemas.microsoft.com/office/word/2006/wordml" xmlns:wps="http://schemas.microsoft.com/office/word/2010/wordprocessingShape" mc:Ignorable="w14 w15 w16se w16cid w16 w16cex w16sdtdh w16sdtfl w16du wp14">
   <w:endnote w:type="separator" w:id="-1">
     <w:p>
       <w:pPr>
@@ -2238,7 +2182,7 @@
 </file>
 
 <file path=word/footer1.xml><?xml version="1.0" encoding="utf-8"?>
-<w:ftr xmlns:wpc="http://schemas.microsoft.com/office/word/2010/wordprocessingCanvas" xmlns:cx="http://schemas.microsoft.com/office/drawing/2014/chartex" xmlns:mc="http://schemas.openxmlformats.org/markup-compatibility/2006" xmlns:o="urn:schemas-microsoft-com:office:office" xmlns:r="http://schemas.openxmlformats.org/officeDocument/2006/relationships" xmlns:m="http://schemas.openxmlformats.org/officeDocument/2006/math" xmlns:v="urn:schemas-microsoft-com:vml" xmlns:wp14="http://schemas.microsoft.com/office/word/2010/wordprocessingDrawing" xmlns:wp="http://schemas.openxmlformats.org/drawingml/2006/wordprocessingDrawing" xmlns:w10="urn:schemas-microsoft-com:office:word" xmlns:w="http://schemas.openxmlformats.org/wordprocessingml/2006/main" xmlns:w14="http://schemas.microsoft.com/office/word/2010/wordml" xmlns:w15="http://schemas.microsoft.com/office/word/2012/wordml" xmlns:w16se="http://schemas.microsoft.com/office/word/2015/wordml/symex" xmlns:wpg="http://schemas.microsoft.com/office/word/2010/wordprocessingGroup" xmlns:wpi="http://schemas.microsoft.com/office/word/2010/wordprocessingInk" xmlns:wne="http://schemas.microsoft.com/office/word/2006/wordml" xmlns:wps="http://schemas.microsoft.com/office/word/2010/wordprocessingShape" mc:Ignorable="w14 w15 w16se wp14">
+<w:ftr xmlns:wpc="http://schemas.microsoft.com/office/word/2010/wordprocessingCanvas" xmlns:cx="http://schemas.microsoft.com/office/drawing/2014/chartex" xmlns:cx1="http://schemas.microsoft.com/office/drawing/2015/9/8/chartex" xmlns:cx2="http://schemas.microsoft.com/office/drawing/2015/10/21/chartex" xmlns:cx3="http://schemas.microsoft.com/office/drawing/2016/5/9/chartex" xmlns:cx4="http://schemas.microsoft.com/office/drawing/2016/5/10/chartex" xmlns:cx5="http://schemas.microsoft.com/office/drawing/2016/5/11/chartex" xmlns:cx6="http://schemas.microsoft.com/office/drawing/2016/5/12/chartex" xmlns:cx7="http://schemas.microsoft.com/office/drawing/2016/5/13/chartex" xmlns:cx8="http://schemas.microsoft.com/office/drawing/2016/5/14/chartex" xmlns:mc="http://schemas.openxmlformats.org/markup-compatibility/2006" xmlns:aink="http://schemas.microsoft.com/office/drawing/2016/ink" xmlns:am3d="http://schemas.microsoft.com/office/drawing/2017/model3d" xmlns:o="urn:schemas-microsoft-com:office:office" xmlns:oel="http://schemas.microsoft.com/office/2019/extlst" xmlns:r="http://schemas.openxmlformats.org/officeDocument/2006/relationships" xmlns:m="http://schemas.openxmlformats.org/officeDocument/2006/math" xmlns:v="urn:schemas-microsoft-com:vml" xmlns:wp14="http://schemas.microsoft.com/office/word/2010/wordprocessingDrawing" xmlns:wp="http://schemas.openxmlformats.org/drawingml/2006/wordprocessingDrawing" xmlns:w10="urn:schemas-microsoft-com:office:word" xmlns:w="http://schemas.openxmlformats.org/wordprocessingml/2006/main" xmlns:w14="http://schemas.microsoft.com/office/word/2010/wordml" xmlns:w15="http://schemas.microsoft.com/office/word/2012/wordml" xmlns:w16cex="http://schemas.microsoft.com/office/word/2018/wordml/cex" xmlns:w16cid="http://schemas.microsoft.com/office/word/2016/wordml/cid" xmlns:w16="http://schemas.microsoft.com/office/word/2018/wordml" xmlns:w16du="http://schemas.microsoft.com/office/word/2023/wordml/word16du" xmlns:w16sdtdh="http://schemas.microsoft.com/office/word/2020/wordml/sdtdatahash" xmlns:w16sdtfl="http://schemas.microsoft.com/office/word/2024/wordml/sdtformatlock" xmlns:w16se="http://schemas.microsoft.com/office/word/2015/wordml/symex" xmlns:wpg="http://schemas.microsoft.com/office/word/2010/wordprocessingGroup" xmlns:wpi="http://schemas.microsoft.com/office/word/2010/wordprocessingInk" xmlns:wne="http://schemas.microsoft.com/office/word/2006/wordml" xmlns:wps="http://schemas.microsoft.com/office/word/2010/wordprocessingShape" mc:Ignorable="w14 w15 w16se w16cid w16 w16cex w16sdtdh w16sdtfl w16du wp14">
   <w:sdt>
     <w:sdtPr>
       <w:id w:val="-937982979"/>
@@ -2247,7 +2191,6 @@
         <w:docPartUnique/>
       </w:docPartObj>
     </w:sdtPr>
-    <w:sdtEndPr/>
     <w:sdtContent>
       <w:p>
         <w:pPr>
@@ -2526,7 +2469,7 @@
 </file>
 
 <file path=word/footnotes.xml><?xml version="1.0" encoding="utf-8"?>
-<w:footnotes xmlns:wpc="http://schemas.microsoft.com/office/word/2010/wordprocessingCanvas" xmlns:cx="http://schemas.microsoft.com/office/drawing/2014/chartex" xmlns:mc="http://schemas.openxmlformats.org/markup-compatibility/2006" xmlns:o="urn:schemas-microsoft-com:office:office" xmlns:r="http://schemas.openxmlformats.org/officeDocument/2006/relationships" xmlns:m="http://schemas.openxmlformats.org/officeDocument/2006/math" xmlns:v="urn:schemas-microsoft-com:vml" xmlns:wp14="http://schemas.microsoft.com/office/word/2010/wordprocessingDrawing" xmlns:wp="http://schemas.openxmlformats.org/drawingml/2006/wordprocessingDrawing" xmlns:w10="urn:schemas-microsoft-com:office:word" xmlns:w="http://schemas.openxmlformats.org/wordprocessingml/2006/main" xmlns:w14="http://schemas.microsoft.com/office/word/2010/wordml" xmlns:w15="http://schemas.microsoft.com/office/word/2012/wordml" xmlns:w16se="http://schemas.microsoft.com/office/word/2015/wordml/symex" xmlns:wpg="http://schemas.microsoft.com/office/word/2010/wordprocessingGroup" xmlns:wpi="http://schemas.microsoft.com/office/word/2010/wordprocessingInk" xmlns:wne="http://schemas.microsoft.com/office/word/2006/wordml" xmlns:wps="http://schemas.microsoft.com/office/word/2010/wordprocessingShape" mc:Ignorable="w14 w15 w16se wp14">
+<w:footnotes xmlns:wpc="http://schemas.microsoft.com/office/word/2010/wordprocessingCanvas" xmlns:cx="http://schemas.microsoft.com/office/drawing/2014/chartex" xmlns:cx1="http://schemas.microsoft.com/office/drawing/2015/9/8/chartex" xmlns:cx2="http://schemas.microsoft.com/office/drawing/2015/10/21/chartex" xmlns:cx3="http://schemas.microsoft.com/office/drawing/2016/5/9/chartex" xmlns:cx4="http://schemas.microsoft.com/office/drawing/2016/5/10/chartex" xmlns:cx5="http://schemas.microsoft.com/office/drawing/2016/5/11/chartex" xmlns:cx6="http://schemas.microsoft.com/office/drawing/2016/5/12/chartex" xmlns:cx7="http://schemas.microsoft.com/office/drawing/2016/5/13/chartex" xmlns:cx8="http://schemas.microsoft.com/office/drawing/2016/5/14/chartex" xmlns:mc="http://schemas.openxmlformats.org/markup-compatibility/2006" xmlns:aink="http://schemas.microsoft.com/office/drawing/2016/ink" xmlns:am3d="http://schemas.microsoft.com/office/drawing/2017/model3d" xmlns:o="urn:schemas-microsoft-com:office:office" xmlns:oel="http://schemas.microsoft.com/office/2019/extlst" xmlns:r="http://schemas.openxmlformats.org/officeDocument/2006/relationships" xmlns:m="http://schemas.openxmlformats.org/officeDocument/2006/math" xmlns:v="urn:schemas-microsoft-com:vml" xmlns:wp14="http://schemas.microsoft.com/office/word/2010/wordprocessingDrawing" xmlns:wp="http://schemas.openxmlformats.org/drawingml/2006/wordprocessingDrawing" xmlns:w10="urn:schemas-microsoft-com:office:word" xmlns:w="http://schemas.openxmlformats.org/wordprocessingml/2006/main" xmlns:w14="http://schemas.microsoft.com/office/word/2010/wordml" xmlns:w15="http://schemas.microsoft.com/office/word/2012/wordml" xmlns:w16cex="http://schemas.microsoft.com/office/word/2018/wordml/cex" xmlns:w16cid="http://schemas.microsoft.com/office/word/2016/wordml/cid" xmlns:w16="http://schemas.microsoft.com/office/word/2018/wordml" xmlns:w16du="http://schemas.microsoft.com/office/word/2023/wordml/word16du" xmlns:w16sdtdh="http://schemas.microsoft.com/office/word/2020/wordml/sdtdatahash" xmlns:w16sdtfl="http://schemas.microsoft.com/office/word/2024/wordml/sdtformatlock" xmlns:w16se="http://schemas.microsoft.com/office/word/2015/wordml/symex" xmlns:wpg="http://schemas.microsoft.com/office/word/2010/wordprocessingGroup" xmlns:wpi="http://schemas.microsoft.com/office/word/2010/wordprocessingInk" xmlns:wne="http://schemas.microsoft.com/office/word/2006/wordml" xmlns:wps="http://schemas.microsoft.com/office/word/2010/wordprocessingShape" mc:Ignorable="w14 w15 w16se w16cid w16 w16cex w16sdtdh w16sdtfl w16du wp14">
   <w:footnote w:type="separator" w:id="-1">
     <w:p>
       <w:pPr>
@@ -2551,7 +2494,7 @@
 </file>
 
 <file path=word/header1.xml><?xml version="1.0" encoding="utf-8"?>
-<w:hdr xmlns:wpc="http://schemas.microsoft.com/office/word/2010/wordprocessingCanvas" xmlns:cx="http://schemas.microsoft.com/office/drawing/2014/chartex" xmlns:mc="http://schemas.openxmlformats.org/markup-compatibility/2006" xmlns:o="urn:schemas-microsoft-com:office:office" xmlns:r="http://schemas.openxmlformats.org/officeDocument/2006/relationships" xmlns:m="http://schemas.openxmlformats.org/officeDocument/2006/math" xmlns:v="urn:schemas-microsoft-com:vml" xmlns:wp14="http://schemas.microsoft.com/office/word/2010/wordprocessingDrawing" xmlns:wp="http://schemas.openxmlformats.org/drawingml/2006/wordprocessingDrawing" xmlns:w10="urn:schemas-microsoft-com:office:word" xmlns:w="http://schemas.openxmlformats.org/wordprocessingml/2006/main" xmlns:w14="http://schemas.microsoft.com/office/word/2010/wordml" xmlns:w15="http://schemas.microsoft.com/office/word/2012/wordml" xmlns:w16se="http://schemas.microsoft.com/office/word/2015/wordml/symex" xmlns:wpg="http://schemas.microsoft.com/office/word/2010/wordprocessingGroup" xmlns:wpi="http://schemas.microsoft.com/office/word/2010/wordprocessingInk" xmlns:wne="http://schemas.microsoft.com/office/word/2006/wordml" xmlns:wps="http://schemas.microsoft.com/office/word/2010/wordprocessingShape" mc:Ignorable="w14 w15 w16se wp14">
+<w:hdr xmlns:wpc="http://schemas.microsoft.com/office/word/2010/wordprocessingCanvas" xmlns:cx="http://schemas.microsoft.com/office/drawing/2014/chartex" xmlns:cx1="http://schemas.microsoft.com/office/drawing/2015/9/8/chartex" xmlns:cx2="http://schemas.microsoft.com/office/drawing/2015/10/21/chartex" xmlns:cx3="http://schemas.microsoft.com/office/drawing/2016/5/9/chartex" xmlns:cx4="http://schemas.microsoft.com/office/drawing/2016/5/10/chartex" xmlns:cx5="http://schemas.microsoft.com/office/drawing/2016/5/11/chartex" xmlns:cx6="http://schemas.microsoft.com/office/drawing/2016/5/12/chartex" xmlns:cx7="http://schemas.microsoft.com/office/drawing/2016/5/13/chartex" xmlns:cx8="http://schemas.microsoft.com/office/drawing/2016/5/14/chartex" xmlns:mc="http://schemas.openxmlformats.org/markup-compatibility/2006" xmlns:aink="http://schemas.microsoft.com/office/drawing/2016/ink" xmlns:am3d="http://schemas.microsoft.com/office/drawing/2017/model3d" xmlns:o="urn:schemas-microsoft-com:office:office" xmlns:oel="http://schemas.microsoft.com/office/2019/extlst" xmlns:r="http://schemas.openxmlformats.org/officeDocument/2006/relationships" xmlns:m="http://schemas.openxmlformats.org/officeDocument/2006/math" xmlns:v="urn:schemas-microsoft-com:vml" xmlns:wp14="http://schemas.microsoft.com/office/word/2010/wordprocessingDrawing" xmlns:wp="http://schemas.openxmlformats.org/drawingml/2006/wordprocessingDrawing" xmlns:w10="urn:schemas-microsoft-com:office:word" xmlns:w="http://schemas.openxmlformats.org/wordprocessingml/2006/main" xmlns:w14="http://schemas.microsoft.com/office/word/2010/wordml" xmlns:w15="http://schemas.microsoft.com/office/word/2012/wordml" xmlns:w16cex="http://schemas.microsoft.com/office/word/2018/wordml/cex" xmlns:w16cid="http://schemas.microsoft.com/office/word/2016/wordml/cid" xmlns:w16="http://schemas.microsoft.com/office/word/2018/wordml" xmlns:w16du="http://schemas.microsoft.com/office/word/2023/wordml/word16du" xmlns:w16sdtdh="http://schemas.microsoft.com/office/word/2020/wordml/sdtdatahash" xmlns:w16sdtfl="http://schemas.microsoft.com/office/word/2024/wordml/sdtformatlock" xmlns:w16se="http://schemas.microsoft.com/office/word/2015/wordml/symex" xmlns:wpg="http://schemas.microsoft.com/office/word/2010/wordprocessingGroup" xmlns:wpi="http://schemas.microsoft.com/office/word/2010/wordprocessingInk" xmlns:wne="http://schemas.microsoft.com/office/word/2006/wordml" xmlns:wps="http://schemas.microsoft.com/office/word/2010/wordprocessingShape" mc:Ignorable="w14 w15 w16se w16cid w16 w16cex w16sdtdh w16sdtfl w16du wp14">
   <w:tbl>
     <w:tblPr>
       <w:tblStyle w:val="Tablaconcuadrcula"/>
@@ -2721,7 +2664,7 @@
 </file>
 
 <file path=word/header2.xml><?xml version="1.0" encoding="utf-8"?>
-<w:hdr xmlns:wpc="http://schemas.microsoft.com/office/word/2010/wordprocessingCanvas" xmlns:cx="http://schemas.microsoft.com/office/drawing/2014/chartex" xmlns:mc="http://schemas.openxmlformats.org/markup-compatibility/2006" xmlns:o="urn:schemas-microsoft-com:office:office" xmlns:r="http://schemas.openxmlformats.org/officeDocument/2006/relationships" xmlns:m="http://schemas.openxmlformats.org/officeDocument/2006/math" xmlns:v="urn:schemas-microsoft-com:vml" xmlns:wp14="http://schemas.microsoft.com/office/word/2010/wordprocessingDrawing" xmlns:wp="http://schemas.openxmlformats.org/drawingml/2006/wordprocessingDrawing" xmlns:w10="urn:schemas-microsoft-com:office:word" xmlns:w="http://schemas.openxmlformats.org/wordprocessingml/2006/main" xmlns:w14="http://schemas.microsoft.com/office/word/2010/wordml" xmlns:w15="http://schemas.microsoft.com/office/word/2012/wordml" xmlns:w16se="http://schemas.microsoft.com/office/word/2015/wordml/symex" xmlns:wpg="http://schemas.microsoft.com/office/word/2010/wordprocessingGroup" xmlns:wpi="http://schemas.microsoft.com/office/word/2010/wordprocessingInk" xmlns:wne="http://schemas.microsoft.com/office/word/2006/wordml" xmlns:wps="http://schemas.microsoft.com/office/word/2010/wordprocessingShape" mc:Ignorable="w14 w15 w16se wp14">
+<w:hdr xmlns:wpc="http://schemas.microsoft.com/office/word/2010/wordprocessingCanvas" xmlns:cx="http://schemas.microsoft.com/office/drawing/2014/chartex" xmlns:cx1="http://schemas.microsoft.com/office/drawing/2015/9/8/chartex" xmlns:cx2="http://schemas.microsoft.com/office/drawing/2015/10/21/chartex" xmlns:cx3="http://schemas.microsoft.com/office/drawing/2016/5/9/chartex" xmlns:cx4="http://schemas.microsoft.com/office/drawing/2016/5/10/chartex" xmlns:cx5="http://schemas.microsoft.com/office/drawing/2016/5/11/chartex" xmlns:cx6="http://schemas.microsoft.com/office/drawing/2016/5/12/chartex" xmlns:cx7="http://schemas.microsoft.com/office/drawing/2016/5/13/chartex" xmlns:cx8="http://schemas.microsoft.com/office/drawing/2016/5/14/chartex" xmlns:mc="http://schemas.openxmlformats.org/markup-compatibility/2006" xmlns:aink="http://schemas.microsoft.com/office/drawing/2016/ink" xmlns:am3d="http://schemas.microsoft.com/office/drawing/2017/model3d" xmlns:o="urn:schemas-microsoft-com:office:office" xmlns:oel="http://schemas.microsoft.com/office/2019/extlst" xmlns:r="http://schemas.openxmlformats.org/officeDocument/2006/relationships" xmlns:m="http://schemas.openxmlformats.org/officeDocument/2006/math" xmlns:v="urn:schemas-microsoft-com:vml" xmlns:wp14="http://schemas.microsoft.com/office/word/2010/wordprocessingDrawing" xmlns:wp="http://schemas.openxmlformats.org/drawingml/2006/wordprocessingDrawing" xmlns:w10="urn:schemas-microsoft-com:office:word" xmlns:w="http://schemas.openxmlformats.org/wordprocessingml/2006/main" xmlns:w14="http://schemas.microsoft.com/office/word/2010/wordml" xmlns:w15="http://schemas.microsoft.com/office/word/2012/wordml" xmlns:w16cex="http://schemas.microsoft.com/office/word/2018/wordml/cex" xmlns:w16cid="http://schemas.microsoft.com/office/word/2016/wordml/cid" xmlns:w16="http://schemas.microsoft.com/office/word/2018/wordml" xmlns:w16du="http://schemas.microsoft.com/office/word/2023/wordml/word16du" xmlns:w16sdtdh="http://schemas.microsoft.com/office/word/2020/wordml/sdtdatahash" xmlns:w16sdtfl="http://schemas.microsoft.com/office/word/2024/wordml/sdtformatlock" xmlns:w16se="http://schemas.microsoft.com/office/word/2015/wordml/symex" xmlns:wpg="http://schemas.microsoft.com/office/word/2010/wordprocessingGroup" xmlns:wpi="http://schemas.microsoft.com/office/word/2010/wordprocessingInk" xmlns:wne="http://schemas.microsoft.com/office/word/2006/wordml" xmlns:wps="http://schemas.microsoft.com/office/word/2010/wordprocessingShape" mc:Ignorable="w14 w15 w16se w16cid w16 w16cex w16sdtdh w16sdtfl w16du wp14">
   <w:tbl>
     <w:tblPr>
       <w:tblStyle w:val="Tablaconcuadrcula"/>
@@ -2994,7 +2937,7 @@
 </file>
 
 <file path=word/numbering.xml><?xml version="1.0" encoding="utf-8"?>
-<w:numbering xmlns:wpc="http://schemas.microsoft.com/office/word/2010/wordprocessingCanvas" xmlns:cx="http://schemas.microsoft.com/office/drawing/2014/chartex" xmlns:mc="http://schemas.openxmlformats.org/markup-compatibility/2006" xmlns:o="urn:schemas-microsoft-com:office:office" xmlns:r="http://schemas.openxmlformats.org/officeDocument/2006/relationships" xmlns:m="http://schemas.openxmlformats.org/officeDocument/2006/math" xmlns:v="urn:schemas-microsoft-com:vml" xmlns:wp14="http://schemas.microsoft.com/office/word/2010/wordprocessingDrawing" xmlns:wp="http://schemas.openxmlformats.org/drawingml/2006/wordprocessingDrawing" xmlns:w10="urn:schemas-microsoft-com:office:word" xmlns:w="http://schemas.openxmlformats.org/wordprocessingml/2006/main" xmlns:w14="http://schemas.microsoft.com/office/word/2010/wordml" xmlns:w15="http://schemas.microsoft.com/office/word/2012/wordml" xmlns:w16se="http://schemas.microsoft.com/office/word/2015/wordml/symex" xmlns:wpg="http://schemas.microsoft.com/office/word/2010/wordprocessingGroup" xmlns:wpi="http://schemas.microsoft.com/office/word/2010/wordprocessingInk" xmlns:wne="http://schemas.microsoft.com/office/word/2006/wordml" xmlns:wps="http://schemas.microsoft.com/office/word/2010/wordprocessingShape" mc:Ignorable="w14 w15 w16se wp14">
+<w:numbering xmlns:wpc="http://schemas.microsoft.com/office/word/2010/wordprocessingCanvas" xmlns:cx="http://schemas.microsoft.com/office/drawing/2014/chartex" xmlns:cx1="http://schemas.microsoft.com/office/drawing/2015/9/8/chartex" xmlns:cx2="http://schemas.microsoft.com/office/drawing/2015/10/21/chartex" xmlns:cx3="http://schemas.microsoft.com/office/drawing/2016/5/9/chartex" xmlns:cx4="http://schemas.microsoft.com/office/drawing/2016/5/10/chartex" xmlns:cx5="http://schemas.microsoft.com/office/drawing/2016/5/11/chartex" xmlns:cx6="http://schemas.microsoft.com/office/drawing/2016/5/12/chartex" xmlns:cx7="http://schemas.microsoft.com/office/drawing/2016/5/13/chartex" xmlns:cx8="http://schemas.microsoft.com/office/drawing/2016/5/14/chartex" xmlns:mc="http://schemas.openxmlformats.org/markup-compatibility/2006" xmlns:aink="http://schemas.microsoft.com/office/drawing/2016/ink" xmlns:am3d="http://schemas.microsoft.com/office/drawing/2017/model3d" xmlns:o="urn:schemas-microsoft-com:office:office" xmlns:oel="http://schemas.microsoft.com/office/2019/extlst" xmlns:r="http://schemas.openxmlformats.org/officeDocument/2006/relationships" xmlns:m="http://schemas.openxmlformats.org/officeDocument/2006/math" xmlns:v="urn:schemas-microsoft-com:vml" xmlns:wp14="http://schemas.microsoft.com/office/word/2010/wordprocessingDrawing" xmlns:wp="http://schemas.openxmlformats.org/drawingml/2006/wordprocessingDrawing" xmlns:w10="urn:schemas-microsoft-com:office:word" xmlns:w="http://schemas.openxmlformats.org/wordprocessingml/2006/main" xmlns:w14="http://schemas.microsoft.com/office/word/2010/wordml" xmlns:w15="http://schemas.microsoft.com/office/word/2012/wordml" xmlns:w16cex="http://schemas.microsoft.com/office/word/2018/wordml/cex" xmlns:w16cid="http://schemas.microsoft.com/office/word/2016/wordml/cid" xmlns:w16="http://schemas.microsoft.com/office/word/2018/wordml" xmlns:w16du="http://schemas.microsoft.com/office/word/2023/wordml/word16du" xmlns:w16sdtdh="http://schemas.microsoft.com/office/word/2020/wordml/sdtdatahash" xmlns:w16sdtfl="http://schemas.microsoft.com/office/word/2024/wordml/sdtformatlock" xmlns:w16se="http://schemas.microsoft.com/office/word/2015/wordml/symex" xmlns:wpg="http://schemas.microsoft.com/office/word/2010/wordprocessingGroup" xmlns:wpi="http://schemas.microsoft.com/office/word/2010/wordprocessingInk" xmlns:wne="http://schemas.microsoft.com/office/word/2006/wordml" xmlns:wps="http://schemas.microsoft.com/office/word/2010/wordprocessingShape" mc:Ignorable="w14 w15 w16se w16cid w16 w16cex w16sdtdh w16sdtfl w16du wp14">
   <w:abstractNum w:abstractNumId="0" w15:restartNumberingAfterBreak="0">
     <w:nsid w:val="049156A1"/>
     <w:multiLevelType w:val="hybridMultilevel"/>
@@ -7568,124 +7511,124 @@
       </w:rPr>
     </w:lvl>
   </w:abstractNum>
-  <w:num w:numId="1">
+  <w:num w:numId="1" w16cid:durableId="738021761">
     <w:abstractNumId w:val="3"/>
   </w:num>
-  <w:num w:numId="2">
+  <w:num w:numId="2" w16cid:durableId="656810342">
     <w:abstractNumId w:val="8"/>
   </w:num>
-  <w:num w:numId="3">
+  <w:num w:numId="3" w16cid:durableId="1079791919">
     <w:abstractNumId w:val="12"/>
   </w:num>
-  <w:num w:numId="4">
+  <w:num w:numId="4" w16cid:durableId="797458155">
     <w:abstractNumId w:val="28"/>
   </w:num>
-  <w:num w:numId="5">
+  <w:num w:numId="5" w16cid:durableId="379595784">
     <w:abstractNumId w:val="30"/>
   </w:num>
-  <w:num w:numId="6">
+  <w:num w:numId="6" w16cid:durableId="1278680119">
     <w:abstractNumId w:val="4"/>
   </w:num>
-  <w:num w:numId="7">
+  <w:num w:numId="7" w16cid:durableId="102960091">
     <w:abstractNumId w:val="11"/>
   </w:num>
-  <w:num w:numId="8">
+  <w:num w:numId="8" w16cid:durableId="917206561">
     <w:abstractNumId w:val="19"/>
   </w:num>
-  <w:num w:numId="9">
+  <w:num w:numId="9" w16cid:durableId="2039308128">
     <w:abstractNumId w:val="15"/>
   </w:num>
-  <w:num w:numId="10">
+  <w:num w:numId="10" w16cid:durableId="737752996">
     <w:abstractNumId w:val="9"/>
   </w:num>
-  <w:num w:numId="11">
+  <w:num w:numId="11" w16cid:durableId="1000353836">
     <w:abstractNumId w:val="24"/>
   </w:num>
-  <w:num w:numId="12">
+  <w:num w:numId="12" w16cid:durableId="1453284393">
     <w:abstractNumId w:val="35"/>
   </w:num>
-  <w:num w:numId="13">
+  <w:num w:numId="13" w16cid:durableId="257064753">
     <w:abstractNumId w:val="29"/>
   </w:num>
-  <w:num w:numId="14">
+  <w:num w:numId="14" w16cid:durableId="439957759">
     <w:abstractNumId w:val="1"/>
   </w:num>
-  <w:num w:numId="15">
+  <w:num w:numId="15" w16cid:durableId="1205024886">
     <w:abstractNumId w:val="36"/>
   </w:num>
-  <w:num w:numId="16">
+  <w:num w:numId="16" w16cid:durableId="1982805295">
     <w:abstractNumId w:val="21"/>
   </w:num>
-  <w:num w:numId="17">
+  <w:num w:numId="17" w16cid:durableId="2127310273">
     <w:abstractNumId w:val="17"/>
   </w:num>
-  <w:num w:numId="18">
+  <w:num w:numId="18" w16cid:durableId="672222787">
     <w:abstractNumId w:val="31"/>
   </w:num>
-  <w:num w:numId="19">
+  <w:num w:numId="19" w16cid:durableId="818811224">
     <w:abstractNumId w:val="10"/>
   </w:num>
-  <w:num w:numId="20">
+  <w:num w:numId="20" w16cid:durableId="968363498">
     <w:abstractNumId w:val="39"/>
   </w:num>
-  <w:num w:numId="21">
+  <w:num w:numId="21" w16cid:durableId="453522410">
     <w:abstractNumId w:val="34"/>
   </w:num>
-  <w:num w:numId="22">
+  <w:num w:numId="22" w16cid:durableId="1894191507">
     <w:abstractNumId w:val="13"/>
   </w:num>
-  <w:num w:numId="23">
+  <w:num w:numId="23" w16cid:durableId="167840023">
     <w:abstractNumId w:val="14"/>
   </w:num>
-  <w:num w:numId="24">
+  <w:num w:numId="24" w16cid:durableId="50856690">
     <w:abstractNumId w:val="5"/>
   </w:num>
-  <w:num w:numId="25">
+  <w:num w:numId="25" w16cid:durableId="1434352781">
     <w:abstractNumId w:val="16"/>
   </w:num>
-  <w:num w:numId="26">
+  <w:num w:numId="26" w16cid:durableId="1780373537">
     <w:abstractNumId w:val="20"/>
   </w:num>
-  <w:num w:numId="27">
+  <w:num w:numId="27" w16cid:durableId="891383840">
     <w:abstractNumId w:val="23"/>
   </w:num>
-  <w:num w:numId="28">
+  <w:num w:numId="28" w16cid:durableId="1061054967">
     <w:abstractNumId w:val="0"/>
   </w:num>
-  <w:num w:numId="29">
+  <w:num w:numId="29" w16cid:durableId="863596890">
     <w:abstractNumId w:val="18"/>
   </w:num>
-  <w:num w:numId="30">
+  <w:num w:numId="30" w16cid:durableId="1610426559">
     <w:abstractNumId w:val="22"/>
   </w:num>
-  <w:num w:numId="31">
+  <w:num w:numId="31" w16cid:durableId="1962030372">
     <w:abstractNumId w:val="2"/>
   </w:num>
-  <w:num w:numId="32">
+  <w:num w:numId="32" w16cid:durableId="1114133580">
     <w:abstractNumId w:val="7"/>
   </w:num>
-  <w:num w:numId="33">
+  <w:num w:numId="33" w16cid:durableId="724522989">
     <w:abstractNumId w:val="32"/>
   </w:num>
-  <w:num w:numId="34">
+  <w:num w:numId="34" w16cid:durableId="147987731">
     <w:abstractNumId w:val="38"/>
   </w:num>
-  <w:num w:numId="35">
+  <w:num w:numId="35" w16cid:durableId="962883130">
     <w:abstractNumId w:val="6"/>
   </w:num>
-  <w:num w:numId="36">
+  <w:num w:numId="36" w16cid:durableId="1976713358">
     <w:abstractNumId w:val="25"/>
   </w:num>
-  <w:num w:numId="37">
+  <w:num w:numId="37" w16cid:durableId="1607075891">
     <w:abstractNumId w:val="37"/>
   </w:num>
-  <w:num w:numId="38">
+  <w:num w:numId="38" w16cid:durableId="1059086935">
     <w:abstractNumId w:val="27"/>
   </w:num>
-  <w:num w:numId="39">
+  <w:num w:numId="39" w16cid:durableId="1468887918">
     <w:abstractNumId w:val="26"/>
   </w:num>
-  <w:num w:numId="40">
+  <w:num w:numId="40" w16cid:durableId="638846454">
     <w:abstractNumId w:val="33"/>
   </w:num>
   <w:numIdMacAtCleanup w:val="18"/>
@@ -7693,7 +7636,7 @@
 </file>
 
 <file path=word/styles.xml><?xml version="1.0" encoding="utf-8"?>
-<w:styles xmlns:mc="http://schemas.openxmlformats.org/markup-compatibility/2006" xmlns:r="http://schemas.openxmlformats.org/officeDocument/2006/relationships" xmlns:w="http://schemas.openxmlformats.org/wordprocessingml/2006/main" xmlns:w14="http://schemas.microsoft.com/office/word/2010/wordml" xmlns:w15="http://schemas.microsoft.com/office/word/2012/wordml" xmlns:w16se="http://schemas.microsoft.com/office/word/2015/wordml/symex" mc:Ignorable="w14 w15 w16se">
+<w:styles xmlns:mc="http://schemas.openxmlformats.org/markup-compatibility/2006" xmlns:r="http://schemas.openxmlformats.org/officeDocument/2006/relationships" xmlns:w="http://schemas.openxmlformats.org/wordprocessingml/2006/main" xmlns:w14="http://schemas.microsoft.com/office/word/2010/wordml" xmlns:w15="http://schemas.microsoft.com/office/word/2012/wordml" xmlns:w16cex="http://schemas.microsoft.com/office/word/2018/wordml/cex" xmlns:w16cid="http://schemas.microsoft.com/office/word/2016/wordml/cid" xmlns:w16="http://schemas.microsoft.com/office/word/2018/wordml" xmlns:w16du="http://schemas.microsoft.com/office/word/2023/wordml/word16du" xmlns:w16sdtdh="http://schemas.microsoft.com/office/word/2020/wordml/sdtdatahash" xmlns:w16sdtfl="http://schemas.microsoft.com/office/word/2024/wordml/sdtformatlock" xmlns:w16se="http://schemas.microsoft.com/office/word/2015/wordml/symex" mc:Ignorable="w14 w15 w16se w16cid w16 w16cex w16sdtdh w16sdtfl w16du">
   <w:docDefaults>
     <w:rPrDefault>
       <w:rPr>
@@ -7709,7 +7652,7 @@
       </w:pPr>
     </w:pPrDefault>
   </w:docDefaults>
-  <w:latentStyles w:defLockedState="0" w:defUIPriority="99" w:defSemiHidden="0" w:defUnhideWhenUsed="0" w:defQFormat="0" w:count="371">
+  <w:latentStyles w:defLockedState="0" w:defUIPriority="99" w:defSemiHidden="0" w:defUnhideWhenUsed="0" w:defQFormat="0" w:count="376">
     <w:lsdException w:name="Normal" w:uiPriority="0" w:qFormat="1"/>
     <w:lsdException w:name="heading 1" w:uiPriority="9" w:qFormat="1"/>
     <w:lsdException w:name="heading 2" w:semiHidden="1" w:uiPriority="9" w:unhideWhenUsed="1" w:qFormat="1"/>
@@ -8081,6 +8024,11 @@
     <w:lsdException w:name="List Table 5 Dark Accent 6" w:uiPriority="50"/>
     <w:lsdException w:name="List Table 6 Colorful Accent 6" w:uiPriority="51"/>
     <w:lsdException w:name="List Table 7 Colorful Accent 6" w:uiPriority="52"/>
+    <w:lsdException w:name="Mention" w:semiHidden="1" w:unhideWhenUsed="1"/>
+    <w:lsdException w:name="Smart Hyperlink" w:semiHidden="1" w:unhideWhenUsed="1"/>
+    <w:lsdException w:name="Hashtag" w:semiHidden="1" w:unhideWhenUsed="1"/>
+    <w:lsdException w:name="Unresolved Mention" w:semiHidden="1" w:unhideWhenUsed="1"/>
+    <w:lsdException w:name="Smart Link" w:semiHidden="1" w:unhideWhenUsed="1"/>
   </w:latentStyles>
   <w:style w:type="paragraph" w:default="1" w:styleId="Normal">
     <w:name w:val="Normal"/>
@@ -9064,7 +9012,7 @@
       <w:szCs w:val="24"/>
     </w:rPr>
   </w:style>
-  <w:style w:type="table" w:styleId="Cuadrculadetablaclara">
+  <w:style w:type="table" w:styleId="Tablaconcuadrculaclara">
     <w:name w:val="Grid Table Light"/>
     <w:basedOn w:val="Tablanormal"/>
     <w:uiPriority w:val="40"/>
@@ -9086,7 +9034,7 @@
   <w:style w:type="table" w:customStyle="1" w:styleId="Cuadrculadetablaclara1">
     <w:name w:val="Cuadrícula de tabla clara1"/>
     <w:basedOn w:val="Tablanormal"/>
-    <w:next w:val="Cuadrculadetablaclara"/>
+    <w:next w:val="Tablaconcuadrculaclara"/>
     <w:uiPriority w:val="40"/>
     <w:rsid w:val="00943DF1"/>
     <w:pPr>
@@ -9127,7 +9075,7 @@
       <w:spacing w:after="0" w:line="240" w:lineRule="auto"/>
     </w:pPr>
   </w:style>
-  <w:style w:type="character" w:styleId="Textoennegrita">
+  <w:style w:type="character" w:styleId="Fuerte">
     <w:name w:val="Strong"/>
     <w:basedOn w:val="Fuentedeprrafopredeter"/>
     <w:uiPriority w:val="22"/>
@@ -9139,532 +9087,6 @@
     </w:rPr>
   </w:style>
 </w:styles>
-</file>
-
-<file path=word/glossary/document.xml><?xml version="1.0" encoding="utf-8"?>
-<w:glossaryDocument xmlns:wpc="http://schemas.microsoft.com/office/word/2010/wordprocessingCanvas" xmlns:cx="http://schemas.microsoft.com/office/drawing/2014/chartex" xmlns:mc="http://schemas.openxmlformats.org/markup-compatibility/2006" xmlns:o="urn:schemas-microsoft-com:office:office" xmlns:r="http://schemas.openxmlformats.org/officeDocument/2006/relationships" xmlns:m="http://schemas.openxmlformats.org/officeDocument/2006/math" xmlns:v="urn:schemas-microsoft-com:vml" xmlns:wp14="http://schemas.microsoft.com/office/word/2010/wordprocessingDrawing" xmlns:wp="http://schemas.openxmlformats.org/drawingml/2006/wordprocessingDrawing" xmlns:w10="urn:schemas-microsoft-com:office:word" xmlns:w="http://schemas.openxmlformats.org/wordprocessingml/2006/main" xmlns:w14="http://schemas.microsoft.com/office/word/2010/wordml" xmlns:w15="http://schemas.microsoft.com/office/word/2012/wordml" xmlns:w16se="http://schemas.microsoft.com/office/word/2015/wordml/symex" xmlns:wpg="http://schemas.microsoft.com/office/word/2010/wordprocessingGroup" xmlns:wpi="http://schemas.microsoft.com/office/word/2010/wordprocessingInk" xmlns:wne="http://schemas.microsoft.com/office/word/2006/wordml" xmlns:wps="http://schemas.microsoft.com/office/word/2010/wordprocessingShape" mc:Ignorable="w14 w15 w16se wp14"/>
-</file>
-
-<file path=word/glossary/fontTable.xml><?xml version="1.0" encoding="utf-8"?>
-<w:fonts xmlns:mc="http://schemas.openxmlformats.org/markup-compatibility/2006" xmlns:r="http://schemas.openxmlformats.org/officeDocument/2006/relationships" xmlns:w="http://schemas.openxmlformats.org/wordprocessingml/2006/main" xmlns:w14="http://schemas.microsoft.com/office/word/2010/wordml" xmlns:w15="http://schemas.microsoft.com/office/word/2012/wordml" xmlns:w16se="http://schemas.microsoft.com/office/word/2015/wordml/symex" mc:Ignorable="w14 w15 w16se">
-  <w:font w:name="Calibri">
-    <w:panose1 w:val="020F0502020204030204"/>
-    <w:charset w:val="00"/>
-    <w:family w:val="swiss"/>
-    <w:pitch w:val="variable"/>
-    <w:sig w:usb0="E4002EFF" w:usb1="C000247B" w:usb2="00000009" w:usb3="00000000" w:csb0="000001FF" w:csb1="00000000"/>
-  </w:font>
-  <w:font w:name="Times New Roman">
-    <w:panose1 w:val="02020603050405020304"/>
-    <w:charset w:val="00"/>
-    <w:family w:val="roman"/>
-    <w:pitch w:val="variable"/>
-    <w:sig w:usb0="E0002EFF" w:usb1="C000785B" w:usb2="00000009" w:usb3="00000000" w:csb0="000001FF" w:csb1="00000000"/>
-  </w:font>
-  <w:font w:name="Courier New">
-    <w:panose1 w:val="02070309020205020404"/>
-    <w:charset w:val="00"/>
-    <w:family w:val="modern"/>
-    <w:pitch w:val="fixed"/>
-    <w:sig w:usb0="E0002EFF" w:usb1="C0007843" w:usb2="00000009" w:usb3="00000000" w:csb0="000001FF" w:csb1="00000000"/>
-  </w:font>
-  <w:font w:name="Wingdings">
-    <w:panose1 w:val="05000000000000000000"/>
-    <w:charset w:val="02"/>
-    <w:family w:val="auto"/>
-    <w:pitch w:val="variable"/>
-    <w:sig w:usb0="00000000" w:usb1="10000000" w:usb2="00000000" w:usb3="00000000" w:csb0="80000000" w:csb1="00000000"/>
-  </w:font>
-  <w:font w:name="Symbol">
-    <w:panose1 w:val="05050102010706020507"/>
-    <w:charset w:val="02"/>
-    <w:family w:val="roman"/>
-    <w:pitch w:val="variable"/>
-    <w:sig w:usb0="00000000" w:usb1="10000000" w:usb2="00000000" w:usb3="00000000" w:csb0="80000000" w:csb1="00000000"/>
-  </w:font>
-  <w:font w:name="Calibri Light">
-    <w:panose1 w:val="020F0302020204030204"/>
-    <w:charset w:val="00"/>
-    <w:family w:val="swiss"/>
-    <w:pitch w:val="variable"/>
-    <w:sig w:usb0="E4002EFF" w:usb1="C000247B" w:usb2="00000009" w:usb3="00000000" w:csb0="000001FF" w:csb1="00000000"/>
-  </w:font>
-  <w:font w:name="Segoe UI">
-    <w:panose1 w:val="020B0502040204020203"/>
-    <w:charset w:val="00"/>
-    <w:family w:val="swiss"/>
-    <w:pitch w:val="variable"/>
-    <w:sig w:usb0="E4002EFF" w:usb1="C000E47F" w:usb2="00000009" w:usb3="00000000" w:csb0="000001FF" w:csb1="00000000"/>
-  </w:font>
-  <w:font w:name="Century Gothic">
-    <w:panose1 w:val="020B0502020202020204"/>
-    <w:charset w:val="00"/>
-    <w:family w:val="swiss"/>
-    <w:pitch w:val="variable"/>
-    <w:sig w:usb0="00000287" w:usb1="00000000" w:usb2="00000000" w:usb3="00000000" w:csb0="0000009F" w:csb1="00000000"/>
-  </w:font>
-</w:fonts>
-</file>
-
-<file path=word/glossary/settings.xml><?xml version="1.0" encoding="utf-8"?>
-<w:settings xmlns:mc="http://schemas.openxmlformats.org/markup-compatibility/2006" xmlns:o="urn:schemas-microsoft-com:office:office" xmlns:r="http://schemas.openxmlformats.org/officeDocument/2006/relationships" xmlns:m="http://schemas.openxmlformats.org/officeDocument/2006/math" xmlns:v="urn:schemas-microsoft-com:vml" xmlns:w10="urn:schemas-microsoft-com:office:word" xmlns:w="http://schemas.openxmlformats.org/wordprocessingml/2006/main" xmlns:w14="http://schemas.microsoft.com/office/word/2010/wordml" xmlns:w15="http://schemas.microsoft.com/office/word/2012/wordml" xmlns:w16se="http://schemas.microsoft.com/office/word/2015/wordml/symex" xmlns:sl="http://schemas.openxmlformats.org/schemaLibrary/2006/main" mc:Ignorable="w14 w15 w16se">
-  <w:defaultTabStop w:val="708"/>
-  <w:hyphenationZone w:val="425"/>
-  <w:characterSpacingControl w:val="doNotCompress"/>
-  <w:compat>
-    <w:useFELayout/>
-    <w:compatSetting w:name="compatibilityMode" w:uri="http://schemas.microsoft.com/office/word" w:val="12"/>
-  </w:compat>
-  <w:rsids>
-    <w:rsidRoot w:val="004A7892"/>
-    <w:rsid w:val="004A7892"/>
-  </w:rsids>
-  <m:mathPr>
-    <m:mathFont m:val="Cambria Math"/>
-    <m:brkBin m:val="before"/>
-    <m:brkBinSub m:val="--"/>
-    <m:smallFrac m:val="0"/>
-    <m:dispDef/>
-    <m:lMargin m:val="0"/>
-    <m:rMargin m:val="0"/>
-    <m:defJc m:val="centerGroup"/>
-    <m:wrapIndent m:val="1440"/>
-    <m:intLim m:val="subSup"/>
-    <m:naryLim m:val="undOvr"/>
-  </m:mathPr>
-  <w:themeFontLang w:val="es-CL"/>
-  <w:clrSchemeMapping w:bg1="light1" w:t1="dark1" w:bg2="light2" w:t2="dark2" w:accent1="accent1" w:accent2="accent2" w:accent3="accent3" w:accent4="accent4" w:accent5="accent5" w:accent6="accent6" w:hyperlink="hyperlink" w:followedHyperlink="followedHyperlink"/>
-  <w:decimalSymbol w:val=","/>
-  <w:listSeparator w:val=";"/>
-</w:settings>
-</file>
-
-<file path=word/glossary/styles.xml><?xml version="1.0" encoding="utf-8"?>
-<w:styles xmlns:mc="http://schemas.openxmlformats.org/markup-compatibility/2006" xmlns:r="http://schemas.openxmlformats.org/officeDocument/2006/relationships" xmlns:w="http://schemas.openxmlformats.org/wordprocessingml/2006/main" xmlns:w14="http://schemas.microsoft.com/office/word/2010/wordml" xmlns:w15="http://schemas.microsoft.com/office/word/2012/wordml" xmlns:w16se="http://schemas.microsoft.com/office/word/2015/wordml/symex" mc:Ignorable="w14 w15 w16se">
-  <w:docDefaults>
-    <w:rPrDefault>
-      <w:rPr>
-        <w:rFonts w:asciiTheme="minorHAnsi" w:eastAsiaTheme="minorEastAsia" w:hAnsiTheme="minorHAnsi" w:cstheme="minorBidi"/>
-        <w:sz w:val="22"/>
-        <w:szCs w:val="22"/>
-        <w:lang w:val="es-CL" w:eastAsia="es-CL" w:bidi="ar-SA"/>
-      </w:rPr>
-    </w:rPrDefault>
-    <w:pPrDefault>
-      <w:pPr>
-        <w:spacing w:after="160" w:line="259" w:lineRule="auto"/>
-      </w:pPr>
-    </w:pPrDefault>
-  </w:docDefaults>
-  <w:latentStyles w:defLockedState="0" w:defUIPriority="99" w:defSemiHidden="0" w:defUnhideWhenUsed="0" w:defQFormat="0" w:count="371">
-    <w:lsdException w:name="Normal" w:uiPriority="0" w:qFormat="1"/>
-    <w:lsdException w:name="heading 1" w:uiPriority="9" w:qFormat="1"/>
-    <w:lsdException w:name="heading 2" w:semiHidden="1" w:uiPriority="9" w:unhideWhenUsed="1" w:qFormat="1"/>
-    <w:lsdException w:name="heading 3" w:semiHidden="1" w:uiPriority="9" w:unhideWhenUsed="1" w:qFormat="1"/>
-    <w:lsdException w:name="heading 4" w:semiHidden="1" w:uiPriority="9" w:unhideWhenUsed="1" w:qFormat="1"/>
-    <w:lsdException w:name="heading 5" w:semiHidden="1" w:uiPriority="9" w:unhideWhenUsed="1" w:qFormat="1"/>
-    <w:lsdException w:name="heading 6" w:semiHidden="1" w:uiPriority="9" w:unhideWhenUsed="1" w:qFormat="1"/>
-    <w:lsdException w:name="heading 7" w:semiHidden="1" w:uiPriority="9" w:unhideWhenUsed="1" w:qFormat="1"/>
-    <w:lsdException w:name="heading 8" w:semiHidden="1" w:uiPriority="9" w:unhideWhenUsed="1" w:qFormat="1"/>
-    <w:lsdException w:name="heading 9" w:semiHidden="1" w:uiPriority="9" w:unhideWhenUsed="1" w:qFormat="1"/>
-    <w:lsdException w:name="index 1" w:semiHidden="1" w:unhideWhenUsed="1"/>
-    <w:lsdException w:name="index 2" w:semiHidden="1" w:unhideWhenUsed="1"/>
-    <w:lsdException w:name="index 3" w:semiHidden="1" w:unhideWhenUsed="1"/>
-    <w:lsdException w:name="index 4" w:semiHidden="1" w:unhideWhenUsed="1"/>
-    <w:lsdException w:name="index 5" w:semiHidden="1" w:unhideWhenUsed="1"/>
-    <w:lsdException w:name="index 6" w:semiHidden="1" w:unhideWhenUsed="1"/>
-    <w:lsdException w:name="index 7" w:semiHidden="1" w:unhideWhenUsed="1"/>
-    <w:lsdException w:name="index 8" w:semiHidden="1" w:unhideWhenUsed="1"/>
-    <w:lsdException w:name="index 9" w:semiHidden="1" w:unhideWhenUsed="1"/>
-    <w:lsdException w:name="toc 1" w:semiHidden="1" w:uiPriority="39" w:unhideWhenUsed="1"/>
-    <w:lsdException w:name="toc 2" w:semiHidden="1" w:uiPriority="39" w:unhideWhenUsed="1"/>
-    <w:lsdException w:name="toc 3" w:semiHidden="1" w:uiPriority="39" w:unhideWhenUsed="1"/>
-    <w:lsdException w:name="toc 4" w:semiHidden="1" w:uiPriority="39" w:unhideWhenUsed="1"/>
-    <w:lsdException w:name="toc 5" w:semiHidden="1" w:uiPriority="39" w:unhideWhenUsed="1"/>
-    <w:lsdException w:name="toc 6" w:semiHidden="1" w:uiPriority="39" w:unhideWhenUsed="1"/>
-    <w:lsdException w:name="toc 7" w:semiHidden="1" w:uiPriority="39" w:unhideWhenUsed="1"/>
-    <w:lsdException w:name="toc 8" w:semiHidden="1" w:uiPriority="39" w:unhideWhenUsed="1"/>
-    <w:lsdException w:name="toc 9" w:semiHidden="1" w:uiPriority="39" w:unhideWhenUsed="1"/>
-    <w:lsdException w:name="Normal Indent" w:semiHidden="1" w:unhideWhenUsed="1"/>
-    <w:lsdException w:name="footnote text" w:semiHidden="1" w:unhideWhenUsed="1"/>
-    <w:lsdException w:name="annotation text" w:semiHidden="1" w:unhideWhenUsed="1"/>
-    <w:lsdException w:name="header" w:semiHidden="1" w:unhideWhenUsed="1"/>
-    <w:lsdException w:name="footer" w:semiHidden="1" w:unhideWhenUsed="1"/>
-    <w:lsdException w:name="index heading" w:semiHidden="1" w:unhideWhenUsed="1"/>
-    <w:lsdException w:name="caption" w:semiHidden="1" w:uiPriority="35" w:unhideWhenUsed="1" w:qFormat="1"/>
-    <w:lsdException w:name="table of figures" w:semiHidden="1" w:unhideWhenUsed="1"/>
-    <w:lsdException w:name="envelope address" w:semiHidden="1" w:unhideWhenUsed="1"/>
-    <w:lsdException w:name="envelope return" w:semiHidden="1" w:unhideWhenUsed="1"/>
-    <w:lsdException w:name="footnote reference" w:semiHidden="1" w:unhideWhenUsed="1"/>
-    <w:lsdException w:name="annotation reference" w:semiHidden="1" w:unhideWhenUsed="1"/>
-    <w:lsdException w:name="line number" w:semiHidden="1" w:unhideWhenUsed="1"/>
-    <w:lsdException w:name="page number" w:semiHidden="1" w:unhideWhenUsed="1"/>
-    <w:lsdException w:name="endnote reference" w:semiHidden="1" w:unhideWhenUsed="1"/>
-    <w:lsdException w:name="endnote text" w:semiHidden="1" w:unhideWhenUsed="1"/>
-    <w:lsdException w:name="table of authorities" w:semiHidden="1" w:unhideWhenUsed="1"/>
-    <w:lsdException w:name="macro" w:semiHidden="1" w:unhideWhenUsed="1"/>
-    <w:lsdException w:name="toa heading" w:semiHidden="1" w:unhideWhenUsed="1"/>
-    <w:lsdException w:name="List" w:semiHidden="1" w:unhideWhenUsed="1"/>
-    <w:lsdException w:name="List Bullet" w:semiHidden="1" w:unhideWhenUsed="1"/>
-    <w:lsdException w:name="List Number" w:semiHidden="1" w:unhideWhenUsed="1"/>
-    <w:lsdException w:name="List 2" w:semiHidden="1" w:unhideWhenUsed="1"/>
-    <w:lsdException w:name="List 3" w:semiHidden="1" w:unhideWhenUsed="1"/>
-    <w:lsdException w:name="List 4" w:semiHidden="1" w:unhideWhenUsed="1"/>
-    <w:lsdException w:name="List 5" w:semiHidden="1" w:unhideWhenUsed="1"/>
-    <w:lsdException w:name="List Bullet 2" w:semiHidden="1" w:unhideWhenUsed="1"/>
-    <w:lsdException w:name="List Bullet 3" w:semiHidden="1" w:unhideWhenUsed="1"/>
-    <w:lsdException w:name="List Bullet 4" w:semiHidden="1" w:unhideWhenUsed="1"/>
-    <w:lsdException w:name="List Bullet 5" w:semiHidden="1" w:unhideWhenUsed="1"/>
-    <w:lsdException w:name="List Number 2" w:semiHidden="1" w:unhideWhenUsed="1"/>
-    <w:lsdException w:name="List Number 3" w:semiHidden="1" w:unhideWhenUsed="1"/>
-    <w:lsdException w:name="List Number 4" w:semiHidden="1" w:unhideWhenUsed="1"/>
-    <w:lsdException w:name="List Number 5" w:semiHidden="1" w:unhideWhenUsed="1"/>
-    <w:lsdException w:name="Title" w:uiPriority="10" w:qFormat="1"/>
-    <w:lsdException w:name="Closing" w:semiHidden="1" w:unhideWhenUsed="1"/>
-    <w:lsdException w:name="Signature" w:semiHidden="1" w:unhideWhenUsed="1"/>
-    <w:lsdException w:name="Default Paragraph Font" w:semiHidden="1" w:uiPriority="1" w:unhideWhenUsed="1"/>
-    <w:lsdException w:name="Body Text" w:semiHidden="1" w:unhideWhenUsed="1"/>
-    <w:lsdException w:name="Body Text Indent" w:semiHidden="1" w:unhideWhenUsed="1"/>
-    <w:lsdException w:name="List Continue" w:semiHidden="1" w:unhideWhenUsed="1"/>
-    <w:lsdException w:name="List Continue 2" w:semiHidden="1" w:unhideWhenUsed="1"/>
-    <w:lsdException w:name="List Continue 3" w:semiHidden="1" w:unhideWhenUsed="1"/>
-    <w:lsdException w:name="List Continue 4" w:semiHidden="1" w:unhideWhenUsed="1"/>
-    <w:lsdException w:name="List Continue 5" w:semiHidden="1" w:unhideWhenUsed="1"/>
-    <w:lsdException w:name="Message Header" w:semiHidden="1" w:unhideWhenUsed="1"/>
-    <w:lsdException w:name="Subtitle" w:uiPriority="11" w:qFormat="1"/>
-    <w:lsdException w:name="Salutation" w:semiHidden="1" w:unhideWhenUsed="1"/>
-    <w:lsdException w:name="Date" w:semiHidden="1" w:unhideWhenUsed="1"/>
-    <w:lsdException w:name="Body Text First Indent" w:semiHidden="1" w:unhideWhenUsed="1"/>
-    <w:lsdException w:name="Body Text First Indent 2" w:semiHidden="1" w:unhideWhenUsed="1"/>
-    <w:lsdException w:name="Note Heading" w:semiHidden="1" w:unhideWhenUsed="1"/>
-    <w:lsdException w:name="Body Text 2" w:semiHidden="1" w:unhideWhenUsed="1"/>
-    <w:lsdException w:name="Body Text 3" w:semiHidden="1" w:unhideWhenUsed="1"/>
-    <w:lsdException w:name="Body Text Indent 2" w:semiHidden="1" w:unhideWhenUsed="1"/>
-    <w:lsdException w:name="Body Text Indent 3" w:semiHidden="1" w:unhideWhenUsed="1"/>
-    <w:lsdException w:name="Block Text" w:semiHidden="1" w:unhideWhenUsed="1"/>
-    <w:lsdException w:name="Hyperlink" w:semiHidden="1" w:unhideWhenUsed="1"/>
-    <w:lsdException w:name="FollowedHyperlink" w:semiHidden="1" w:unhideWhenUsed="1"/>
-    <w:lsdException w:name="Strong" w:uiPriority="22" w:qFormat="1"/>
-    <w:lsdException w:name="Emphasis" w:uiPriority="20" w:qFormat="1"/>
-    <w:lsdException w:name="Document Map" w:semiHidden="1" w:unhideWhenUsed="1"/>
-    <w:lsdException w:name="Plain Text" w:semiHidden="1" w:unhideWhenUsed="1"/>
-    <w:lsdException w:name="E-mail Signature" w:semiHidden="1" w:unhideWhenUsed="1"/>
-    <w:lsdException w:name="HTML Top of Form" w:semiHidden="1" w:unhideWhenUsed="1"/>
-    <w:lsdException w:name="HTML Bottom of Form" w:semiHidden="1" w:unhideWhenUsed="1"/>
-    <w:lsdException w:name="Normal (Web)" w:semiHidden="1" w:unhideWhenUsed="1"/>
-    <w:lsdException w:name="HTML Acronym" w:semiHidden="1" w:unhideWhenUsed="1"/>
-    <w:lsdException w:name="HTML Address" w:semiHidden="1" w:unhideWhenUsed="1"/>
-    <w:lsdException w:name="HTML Cite" w:semiHidden="1" w:unhideWhenUsed="1"/>
-    <w:lsdException w:name="HTML Code" w:semiHidden="1" w:unhideWhenUsed="1"/>
-    <w:lsdException w:name="HTML Definition" w:semiHidden="1" w:unhideWhenUsed="1"/>
-    <w:lsdException w:name="HTML Keyboard" w:semiHidden="1" w:unhideWhenUsed="1"/>
-    <w:lsdException w:name="HTML Preformatted" w:semiHidden="1" w:unhideWhenUsed="1"/>
-    <w:lsdException w:name="HTML Sample" w:semiHidden="1" w:unhideWhenUsed="1"/>
-    <w:lsdException w:name="HTML Typewriter" w:semiHidden="1" w:unhideWhenUsed="1"/>
-    <w:lsdException w:name="HTML Variable" w:semiHidden="1" w:unhideWhenUsed="1"/>
-    <w:lsdException w:name="Normal Table" w:semiHidden="1" w:unhideWhenUsed="1"/>
-    <w:lsdException w:name="annotation subject" w:semiHidden="1" w:unhideWhenUsed="1"/>
-    <w:lsdException w:name="No List" w:semiHidden="1" w:unhideWhenUsed="1"/>
-    <w:lsdException w:name="Outline List 1" w:semiHidden="1" w:unhideWhenUsed="1"/>
-    <w:lsdException w:name="Outline List 2" w:semiHidden="1" w:unhideWhenUsed="1"/>
-    <w:lsdException w:name="Outline List 3" w:semiHidden="1" w:unhideWhenUsed="1"/>
-    <w:lsdException w:name="Table Simple 1" w:semiHidden="1" w:unhideWhenUsed="1"/>
-    <w:lsdException w:name="Table Simple 2" w:semiHidden="1" w:unhideWhenUsed="1"/>
-    <w:lsdException w:name="Table Simple 3" w:semiHidden="1" w:unhideWhenUsed="1"/>
-    <w:lsdException w:name="Table Classic 1" w:semiHidden="1" w:unhideWhenUsed="1"/>
-    <w:lsdException w:name="Table Classic 2" w:semiHidden="1" w:unhideWhenUsed="1"/>
-    <w:lsdException w:name="Table Classic 3" w:semiHidden="1" w:unhideWhenUsed="1"/>
-    <w:lsdException w:name="Table Classic 4" w:semiHidden="1" w:unhideWhenUsed="1"/>
-    <w:lsdException w:name="Table Colorful 1" w:semiHidden="1" w:unhideWhenUsed="1"/>
-    <w:lsdException w:name="Table Colorful 2" w:semiHidden="1" w:unhideWhenUsed="1"/>
-    <w:lsdException w:name="Table Colorful 3" w:semiHidden="1" w:unhideWhenUsed="1"/>
-    <w:lsdException w:name="Table Columns 1" w:semiHidden="1" w:unhideWhenUsed="1"/>
-    <w:lsdException w:name="Table Columns 2" w:semiHidden="1" w:unhideWhenUsed="1"/>
-    <w:lsdException w:name="Table Columns 3" w:semiHidden="1" w:unhideWhenUsed="1"/>
-    <w:lsdException w:name="Table Columns 4" w:semiHidden="1" w:unhideWhenUsed="1"/>
-    <w:lsdException w:name="Table Columns 5" w:semiHidden="1" w:unhideWhenUsed="1"/>
-    <w:lsdException w:name="Table Grid 1" w:semiHidden="1" w:unhideWhenUsed="1"/>
-    <w:lsdException w:name="Table Grid 2" w:semiHidden="1" w:unhideWhenUsed="1"/>
-    <w:lsdException w:name="Table Grid 3" w:semiHidden="1" w:unhideWhenUsed="1"/>
-    <w:lsdException w:name="Table Grid 4" w:semiHidden="1" w:unhideWhenUsed="1"/>
-    <w:lsdException w:name="Table Grid 5" w:semiHidden="1" w:unhideWhenUsed="1"/>
-    <w:lsdException w:name="Table Grid 6" w:semiHidden="1" w:unhideWhenUsed="1"/>
-    <w:lsdException w:name="Table Grid 7" w:semiHidden="1" w:unhideWhenUsed="1"/>
-    <w:lsdException w:name="Table Grid 8" w:semiHidden="1" w:unhideWhenUsed="1"/>
-    <w:lsdException w:name="Table List 1" w:semiHidden="1" w:unhideWhenUsed="1"/>
-    <w:lsdException w:name="Table List 2" w:semiHidden="1" w:unhideWhenUsed="1"/>
-    <w:lsdException w:name="Table List 3" w:semiHidden="1" w:unhideWhenUsed="1"/>
-    <w:lsdException w:name="Table List 4" w:semiHidden="1" w:unhideWhenUsed="1"/>
-    <w:lsdException w:name="Table List 5" w:semiHidden="1" w:unhideWhenUsed="1"/>
-    <w:lsdException w:name="Table List 6" w:semiHidden="1" w:unhideWhenUsed="1"/>
-    <w:lsdException w:name="Table List 7" w:semiHidden="1" w:unhideWhenUsed="1"/>
-    <w:lsdException w:name="Table List 8" w:semiHidden="1" w:unhideWhenUsed="1"/>
-    <w:lsdException w:name="Table 3D effects 1" w:semiHidden="1" w:unhideWhenUsed="1"/>
-    <w:lsdException w:name="Table 3D effects 2" w:semiHidden="1" w:unhideWhenUsed="1"/>
-    <w:lsdException w:name="Table 3D effects 3" w:semiHidden="1" w:unhideWhenUsed="1"/>
-    <w:lsdException w:name="Table Contemporary" w:semiHidden="1" w:unhideWhenUsed="1"/>
-    <w:lsdException w:name="Table Elegant" w:semiHidden="1" w:unhideWhenUsed="1"/>
-    <w:lsdException w:name="Table Professional" w:semiHidden="1" w:unhideWhenUsed="1"/>
-    <w:lsdException w:name="Table Subtle 1" w:semiHidden="1" w:unhideWhenUsed="1"/>
-    <w:lsdException w:name="Table Subtle 2" w:semiHidden="1" w:unhideWhenUsed="1"/>
-    <w:lsdException w:name="Table Web 1" w:semiHidden="1" w:unhideWhenUsed="1"/>
-    <w:lsdException w:name="Table Web 2" w:semiHidden="1" w:unhideWhenUsed="1"/>
-    <w:lsdException w:name="Table Web 3" w:semiHidden="1" w:unhideWhenUsed="1"/>
-    <w:lsdException w:name="Balloon Text" w:semiHidden="1" w:unhideWhenUsed="1"/>
-    <w:lsdException w:name="Table Grid" w:uiPriority="39"/>
-    <w:lsdException w:name="Table Theme" w:semiHidden="1" w:unhideWhenUsed="1"/>
-    <w:lsdException w:name="Placeholder Text" w:semiHidden="1"/>
-    <w:lsdException w:name="No Spacing" w:uiPriority="1" w:qFormat="1"/>
-    <w:lsdException w:name="Light Shading" w:uiPriority="60"/>
-    <w:lsdException w:name="Light List" w:uiPriority="61"/>
-    <w:lsdException w:name="Light Grid" w:uiPriority="62"/>
-    <w:lsdException w:name="Medium Shading 1" w:uiPriority="63"/>
-    <w:lsdException w:name="Medium Shading 2" w:uiPriority="64"/>
-    <w:lsdException w:name="Medium List 1" w:uiPriority="65"/>
-    <w:lsdException w:name="Medium List 2" w:uiPriority="66"/>
-    <w:lsdException w:name="Medium Grid 1" w:uiPriority="67"/>
-    <w:lsdException w:name="Medium Grid 2" w:uiPriority="68"/>
-    <w:lsdException w:name="Medium Grid 3" w:uiPriority="69"/>
-    <w:lsdException w:name="Dark List" w:uiPriority="70"/>
-    <w:lsdException w:name="Colorful Shading" w:uiPriority="71"/>
-    <w:lsdException w:name="Colorful List" w:uiPriority="72"/>
-    <w:lsdException w:name="Colorful Grid" w:uiPriority="73"/>
-    <w:lsdException w:name="Light Shading Accent 1" w:uiPriority="60"/>
-    <w:lsdException w:name="Light List Accent 1" w:uiPriority="61"/>
-    <w:lsdException w:name="Light Grid Accent 1" w:uiPriority="62"/>
-    <w:lsdException w:name="Medium Shading 1 Accent 1" w:uiPriority="63"/>
-    <w:lsdException w:name="Medium Shading 2 Accent 1" w:uiPriority="64"/>
-    <w:lsdException w:name="Medium List 1 Accent 1" w:uiPriority="65"/>
-    <w:lsdException w:name="Revision" w:semiHidden="1"/>
-    <w:lsdException w:name="List Paragraph" w:uiPriority="34" w:qFormat="1"/>
-    <w:lsdException w:name="Quote" w:uiPriority="29" w:qFormat="1"/>
-    <w:lsdException w:name="Intense Quote" w:uiPriority="30" w:qFormat="1"/>
-    <w:lsdException w:name="Medium List 2 Accent 1" w:uiPriority="66"/>
-    <w:lsdException w:name="Medium Grid 1 Accent 1" w:uiPriority="67"/>
-    <w:lsdException w:name="Medium Grid 2 Accent 1" w:uiPriority="68"/>
-    <w:lsdException w:name="Medium Grid 3 Accent 1" w:uiPriority="69"/>
-    <w:lsdException w:name="Dark List Accent 1" w:uiPriority="70"/>
-    <w:lsdException w:name="Colorful Shading Accent 1" w:uiPriority="71"/>
-    <w:lsdException w:name="Colorful List Accent 1" w:uiPriority="72"/>
-    <w:lsdException w:name="Colorful Grid Accent 1" w:uiPriority="73"/>
-    <w:lsdException w:name="Light Shading Accent 2" w:uiPriority="60"/>
-    <w:lsdException w:name="Light List Accent 2" w:uiPriority="61"/>
-    <w:lsdException w:name="Light Grid Accent 2" w:uiPriority="62"/>
-    <w:lsdException w:name="Medium Shading 1 Accent 2" w:uiPriority="63"/>
-    <w:lsdException w:name="Medium Shading 2 Accent 2" w:uiPriority="64"/>
-    <w:lsdException w:name="Medium List 1 Accent 2" w:uiPriority="65"/>
-    <w:lsdException w:name="Medium List 2 Accent 2" w:uiPriority="66"/>
-    <w:lsdException w:name="Medium Grid 1 Accent 2" w:uiPriority="67"/>
-    <w:lsdException w:name="Medium Grid 2 Accent 2" w:uiPriority="68"/>
-    <w:lsdException w:name="Medium Grid 3 Accent 2" w:uiPriority="69"/>
-    <w:lsdException w:name="Dark List Accent 2" w:uiPriority="70"/>
-    <w:lsdException w:name="Colorful Shading Accent 2" w:uiPriority="71"/>
-    <w:lsdException w:name="Colorful List Accent 2" w:uiPriority="72"/>
-    <w:lsdException w:name="Colorful Grid Accent 2" w:uiPriority="73"/>
-    <w:lsdException w:name="Light Shading Accent 3" w:uiPriority="60"/>
-    <w:lsdException w:name="Light List Accent 3" w:uiPriority="61"/>
-    <w:lsdException w:name="Light Grid Accent 3" w:uiPriority="62"/>
-    <w:lsdException w:name="Medium Shading 1 Accent 3" w:uiPriority="63"/>
-    <w:lsdException w:name="Medium Shading 2 Accent 3" w:uiPriority="64"/>
-    <w:lsdException w:name="Medium List 1 Accent 3" w:uiPriority="65"/>
-    <w:lsdException w:name="Medium List 2 Accent 3" w:uiPriority="66"/>
-    <w:lsdException w:name="Medium Grid 1 Accent 3" w:uiPriority="67"/>
-    <w:lsdException w:name="Medium Grid 2 Accent 3" w:uiPriority="68"/>
-    <w:lsdException w:name="Medium Grid 3 Accent 3" w:uiPriority="69"/>
-    <w:lsdException w:name="Dark List Accent 3" w:uiPriority="70"/>
-    <w:lsdException w:name="Colorful Shading Accent 3" w:uiPriority="71"/>
-    <w:lsdException w:name="Colorful List Accent 3" w:uiPriority="72"/>
-    <w:lsdException w:name="Colorful Grid Accent 3" w:uiPriority="73"/>
-    <w:lsdException w:name="Light Shading Accent 4" w:uiPriority="60"/>
-    <w:lsdException w:name="Light List Accent 4" w:uiPriority="61"/>
-    <w:lsdException w:name="Light Grid Accent 4" w:uiPriority="62"/>
-    <w:lsdException w:name="Medium Shading 1 Accent 4" w:uiPriority="63"/>
-    <w:lsdException w:name="Medium Shading 2 Accent 4" w:uiPriority="64"/>
-    <w:lsdException w:name="Medium List 1 Accent 4" w:uiPriority="65"/>
-    <w:lsdException w:name="Medium List 2 Accent 4" w:uiPriority="66"/>
-    <w:lsdException w:name="Medium Grid 1 Accent 4" w:uiPriority="67"/>
-    <w:lsdException w:name="Medium Grid 2 Accent 4" w:uiPriority="68"/>
-    <w:lsdException w:name="Medium Grid 3 Accent 4" w:uiPriority="69"/>
-    <w:lsdException w:name="Dark List Accent 4" w:uiPriority="70"/>
-    <w:lsdException w:name="Colorful Shading Accent 4" w:uiPriority="71"/>
-    <w:lsdException w:name="Colorful List Accent 4" w:uiPriority="72"/>
-    <w:lsdException w:name="Colorful Grid Accent 4" w:uiPriority="73"/>
-    <w:lsdException w:name="Light Shading Accent 5" w:uiPriority="60"/>
-    <w:lsdException w:name="Light List Accent 5" w:uiPriority="61"/>
-    <w:lsdException w:name="Light Grid Accent 5" w:uiPriority="62"/>
-    <w:lsdException w:name="Medium Shading 1 Accent 5" w:uiPriority="63"/>
-    <w:lsdException w:name="Medium Shading 2 Accent 5" w:uiPriority="64"/>
-    <w:lsdException w:name="Medium List 1 Accent 5" w:uiPriority="65"/>
-    <w:lsdException w:name="Medium List 2 Accent 5" w:uiPriority="66"/>
-    <w:lsdException w:name="Medium Grid 1 Accent 5" w:uiPriority="67"/>
-    <w:lsdException w:name="Medium Grid 2 Accent 5" w:uiPriority="68"/>
-    <w:lsdException w:name="Medium Grid 3 Accent 5" w:uiPriority="69"/>
-    <w:lsdException w:name="Dark List Accent 5" w:uiPriority="70"/>
-    <w:lsdException w:name="Colorful Shading Accent 5" w:uiPriority="71"/>
-    <w:lsdException w:name="Colorful List Accent 5" w:uiPriority="72"/>
-    <w:lsdException w:name="Colorful Grid Accent 5" w:uiPriority="73"/>
-    <w:lsdException w:name="Light Shading Accent 6" w:uiPriority="60"/>
-    <w:lsdException w:name="Light List Accent 6" w:uiPriority="61"/>
-    <w:lsdException w:name="Light Grid Accent 6" w:uiPriority="62"/>
-    <w:lsdException w:name="Medium Shading 1 Accent 6" w:uiPriority="63"/>
-    <w:lsdException w:name="Medium Shading 2 Accent 6" w:uiPriority="64"/>
-    <w:lsdException w:name="Medium List 1 Accent 6" w:uiPriority="65"/>
-    <w:lsdException w:name="Medium List 2 Accent 6" w:uiPriority="66"/>
-    <w:lsdException w:name="Medium Grid 1 Accent 6" w:uiPriority="67"/>
-    <w:lsdException w:name="Medium Grid 2 Accent 6" w:uiPriority="68"/>
-    <w:lsdException w:name="Medium Grid 3 Accent 6" w:uiPriority="69"/>
-    <w:lsdException w:name="Dark List Accent 6" w:uiPriority="70"/>
-    <w:lsdException w:name="Colorful Shading Accent 6" w:uiPriority="71"/>
-    <w:lsdException w:name="Colorful List Accent 6" w:uiPriority="72"/>
-    <w:lsdException w:name="Colorful Grid Accent 6" w:uiPriority="73"/>
-    <w:lsdException w:name="Subtle Emphasis" w:uiPriority="19" w:qFormat="1"/>
-    <w:lsdException w:name="Intense Emphasis" w:uiPriority="21" w:qFormat="1"/>
-    <w:lsdException w:name="Subtle Reference" w:uiPriority="31" w:qFormat="1"/>
-    <w:lsdException w:name="Intense Reference" w:uiPriority="32" w:qFormat="1"/>
-    <w:lsdException w:name="Book Title" w:uiPriority="33" w:qFormat="1"/>
-    <w:lsdException w:name="Bibliography" w:semiHidden="1" w:uiPriority="37" w:unhideWhenUsed="1"/>
-    <w:lsdException w:name="TOC Heading" w:semiHidden="1" w:uiPriority="39" w:unhideWhenUsed="1" w:qFormat="1"/>
-    <w:lsdException w:name="Plain Table 1" w:uiPriority="41"/>
-    <w:lsdException w:name="Plain Table 2" w:uiPriority="42"/>
-    <w:lsdException w:name="Plain Table 3" w:uiPriority="43"/>
-    <w:lsdException w:name="Plain Table 4" w:uiPriority="44"/>
-    <w:lsdException w:name="Plain Table 5" w:uiPriority="45"/>
-    <w:lsdException w:name="Grid Table Light" w:uiPriority="40"/>
-    <w:lsdException w:name="Grid Table 1 Light" w:uiPriority="46"/>
-    <w:lsdException w:name="Grid Table 2" w:uiPriority="47"/>
-    <w:lsdException w:name="Grid Table 3" w:uiPriority="48"/>
-    <w:lsdException w:name="Grid Table 4" w:uiPriority="49"/>
-    <w:lsdException w:name="Grid Table 5 Dark" w:uiPriority="50"/>
-    <w:lsdException w:name="Grid Table 6 Colorful" w:uiPriority="51"/>
-    <w:lsdException w:name="Grid Table 7 Colorful" w:uiPriority="52"/>
-    <w:lsdException w:name="Grid Table 1 Light Accent 1" w:uiPriority="46"/>
-    <w:lsdException w:name="Grid Table 2 Accent 1" w:uiPriority="47"/>
-    <w:lsdException w:name="Grid Table 3 Accent 1" w:uiPriority="48"/>
-    <w:lsdException w:name="Grid Table 4 Accent 1" w:uiPriority="49"/>
-    <w:lsdException w:name="Grid Table 5 Dark Accent 1" w:uiPriority="50"/>
-    <w:lsdException w:name="Grid Table 6 Colorful Accent 1" w:uiPriority="51"/>
-    <w:lsdException w:name="Grid Table 7 Colorful Accent 1" w:uiPriority="52"/>
-    <w:lsdException w:name="Grid Table 1 Light Accent 2" w:uiPriority="46"/>
-    <w:lsdException w:name="Grid Table 2 Accent 2" w:uiPriority="47"/>
-    <w:lsdException w:name="Grid Table 3 Accent 2" w:uiPriority="48"/>
-    <w:lsdException w:name="Grid Table 4 Accent 2" w:uiPriority="49"/>
-    <w:lsdException w:name="Grid Table 5 Dark Accent 2" w:uiPriority="50"/>
-    <w:lsdException w:name="Grid Table 6 Colorful Accent 2" w:uiPriority="51"/>
-    <w:lsdException w:name="Grid Table 7 Colorful Accent 2" w:uiPriority="52"/>
-    <w:lsdException w:name="Grid Table 1 Light Accent 3" w:uiPriority="46"/>
-    <w:lsdException w:name="Grid Table 2 Accent 3" w:uiPriority="47"/>
-    <w:lsdException w:name="Grid Table 3 Accent 3" w:uiPriority="48"/>
-    <w:lsdException w:name="Grid Table 4 Accent 3" w:uiPriority="49"/>
-    <w:lsdException w:name="Grid Table 5 Dark Accent 3" w:uiPriority="50"/>
-    <w:lsdException w:name="Grid Table 6 Colorful Accent 3" w:uiPriority="51"/>
-    <w:lsdException w:name="Grid Table 7 Colorful Accent 3" w:uiPriority="52"/>
-    <w:lsdException w:name="Grid Table 1 Light Accent 4" w:uiPriority="46"/>
-    <w:lsdException w:name="Grid Table 2 Accent 4" w:uiPriority="47"/>
-    <w:lsdException w:name="Grid Table 3 Accent 4" w:uiPriority="48"/>
-    <w:lsdException w:name="Grid Table 4 Accent 4" w:uiPriority="49"/>
-    <w:lsdException w:name="Grid Table 5 Dark Accent 4" w:uiPriority="50"/>
-    <w:lsdException w:name="Grid Table 6 Colorful Accent 4" w:uiPriority="51"/>
-    <w:lsdException w:name="Grid Table 7 Colorful Accent 4" w:uiPriority="52"/>
-    <w:lsdException w:name="Grid Table 1 Light Accent 5" w:uiPriority="46"/>
-    <w:lsdException w:name="Grid Table 2 Accent 5" w:uiPriority="47"/>
-    <w:lsdException w:name="Grid Table 3 Accent 5" w:uiPriority="48"/>
-    <w:lsdException w:name="Grid Table 4 Accent 5" w:uiPriority="49"/>
-    <w:lsdException w:name="Grid Table 5 Dark Accent 5" w:uiPriority="50"/>
-    <w:lsdException w:name="Grid Table 6 Colorful Accent 5" w:uiPriority="51"/>
-    <w:lsdException w:name="Grid Table 7 Colorful Accent 5" w:uiPriority="52"/>
-    <w:lsdException w:name="Grid Table 1 Light Accent 6" w:uiPriority="46"/>
-    <w:lsdException w:name="Grid Table 2 Accent 6" w:uiPriority="47"/>
-    <w:lsdException w:name="Grid Table 3 Accent 6" w:uiPriority="48"/>
-    <w:lsdException w:name="Grid Table 4 Accent 6" w:uiPriority="49"/>
-    <w:lsdException w:name="Grid Table 5 Dark Accent 6" w:uiPriority="50"/>
-    <w:lsdException w:name="Grid Table 6 Colorful Accent 6" w:uiPriority="51"/>
-    <w:lsdException w:name="Grid Table 7 Colorful Accent 6" w:uiPriority="52"/>
-    <w:lsdException w:name="List Table 1 Light" w:uiPriority="46"/>
-    <w:lsdException w:name="List Table 2" w:uiPriority="47"/>
-    <w:lsdException w:name="List Table 3" w:uiPriority="48"/>
-    <w:lsdException w:name="List Table 4" w:uiPriority="49"/>
-    <w:lsdException w:name="List Table 5 Dark" w:uiPriority="50"/>
-    <w:lsdException w:name="List Table 6 Colorful" w:uiPriority="51"/>
-    <w:lsdException w:name="List Table 7 Colorful" w:uiPriority="52"/>
-    <w:lsdException w:name="List Table 1 Light Accent 1" w:uiPriority="46"/>
-    <w:lsdException w:name="List Table 2 Accent 1" w:uiPriority="47"/>
-    <w:lsdException w:name="List Table 3 Accent 1" w:uiPriority="48"/>
-    <w:lsdException w:name="List Table 4 Accent 1" w:uiPriority="49"/>
-    <w:lsdException w:name="List Table 5 Dark Accent 1" w:uiPriority="50"/>
-    <w:lsdException w:name="List Table 6 Colorful Accent 1" w:uiPriority="51"/>
-    <w:lsdException w:name="List Table 7 Colorful Accent 1" w:uiPriority="52"/>
-    <w:lsdException w:name="List Table 1 Light Accent 2" w:uiPriority="46"/>
-    <w:lsdException w:name="List Table 2 Accent 2" w:uiPriority="47"/>
-    <w:lsdException w:name="List Table 3 Accent 2" w:uiPriority="48"/>
-    <w:lsdException w:name="List Table 4 Accent 2" w:uiPriority="49"/>
-    <w:lsdException w:name="List Table 5 Dark Accent 2" w:uiPriority="50"/>
-    <w:lsdException w:name="List Table 6 Colorful Accent 2" w:uiPriority="51"/>
-    <w:lsdException w:name="List Table 7 Colorful Accent 2" w:uiPriority="52"/>
-    <w:lsdException w:name="List Table 1 Light Accent 3" w:uiPriority="46"/>
-    <w:lsdException w:name="List Table 2 Accent 3" w:uiPriority="47"/>
-    <w:lsdException w:name="List Table 3 Accent 3" w:uiPriority="48"/>
-    <w:lsdException w:name="List Table 4 Accent 3" w:uiPriority="49"/>
-    <w:lsdException w:name="List Table 5 Dark Accent 3" w:uiPriority="50"/>
-    <w:lsdException w:name="List Table 6 Colorful Accent 3" w:uiPriority="51"/>
-    <w:lsdException w:name="List Table 7 Colorful Accent 3" w:uiPriority="52"/>
-    <w:lsdException w:name="List Table 1 Light Accent 4" w:uiPriority="46"/>
-    <w:lsdException w:name="List Table 2 Accent 4" w:uiPriority="47"/>
-    <w:lsdException w:name="List Table 3 Accent 4" w:uiPriority="48"/>
-    <w:lsdException w:name="List Table 4 Accent 4" w:uiPriority="49"/>
-    <w:lsdException w:name="List Table 5 Dark Accent 4" w:uiPriority="50"/>
-    <w:lsdException w:name="List Table 6 Colorful Accent 4" w:uiPriority="51"/>
-    <w:lsdException w:name="List Table 7 Colorful Accent 4" w:uiPriority="52"/>
-    <w:lsdException w:name="List Table 1 Light Accent 5" w:uiPriority="46"/>
-    <w:lsdException w:name="List Table 2 Accent 5" w:uiPriority="47"/>
-    <w:lsdException w:name="List Table 3 Accent 5" w:uiPriority="48"/>
-    <w:lsdException w:name="List Table 4 Accent 5" w:uiPriority="49"/>
-    <w:lsdException w:name="List Table 5 Dark Accent 5" w:uiPriority="50"/>
-    <w:lsdException w:name="List Table 6 Colorful Accent 5" w:uiPriority="51"/>
-    <w:lsdException w:name="List Table 7 Colorful Accent 5" w:uiPriority="52"/>
-    <w:lsdException w:name="List Table 1 Light Accent 6" w:uiPriority="46"/>
-    <w:lsdException w:name="List Table 2 Accent 6" w:uiPriority="47"/>
-    <w:lsdException w:name="List Table 3 Accent 6" w:uiPriority="48"/>
-    <w:lsdException w:name="List Table 4 Accent 6" w:uiPriority="49"/>
-    <w:lsdException w:name="List Table 5 Dark Accent 6" w:uiPriority="50"/>
-    <w:lsdException w:name="List Table 6 Colorful Accent 6" w:uiPriority="51"/>
-    <w:lsdException w:name="List Table 7 Colorful Accent 6" w:uiPriority="52"/>
-  </w:latentStyles>
-  <w:style w:type="paragraph" w:default="1" w:styleId="Normal">
-    <w:name w:val="Normal"/>
-    <w:qFormat/>
-  </w:style>
-  <w:style w:type="character" w:default="1" w:styleId="Fuentedeprrafopredeter">
-    <w:name w:val="Default Paragraph Font"/>
-    <w:uiPriority w:val="1"/>
-    <w:semiHidden/>
-    <w:unhideWhenUsed/>
-  </w:style>
-  <w:style w:type="table" w:default="1" w:styleId="Tablanormal">
-    <w:name w:val="Normal Table"/>
-    <w:uiPriority w:val="99"/>
-    <w:semiHidden/>
-    <w:unhideWhenUsed/>
-    <w:tblPr>
-      <w:tblInd w:w="0" w:type="dxa"/>
-      <w:tblCellMar>
-        <w:top w:w="0" w:type="dxa"/>
-        <w:left w:w="108" w:type="dxa"/>
-        <w:bottom w:w="0" w:type="dxa"/>
-        <w:right w:w="108" w:type="dxa"/>
-      </w:tblCellMar>
-    </w:tblPr>
-  </w:style>
-  <w:style w:type="numbering" w:default="1" w:styleId="Sinlista">
-    <w:name w:val="No List"/>
-    <w:uiPriority w:val="99"/>
-    <w:semiHidden/>
-    <w:unhideWhenUsed/>
-  </w:style>
-</w:styles>
-</file>
-
-<file path=word/glossary/webSettings.xml><?xml version="1.0" encoding="utf-8"?>
-<w:webSettings xmlns:mc="http://schemas.openxmlformats.org/markup-compatibility/2006" xmlns:r="http://schemas.openxmlformats.org/officeDocument/2006/relationships" xmlns:w="http://schemas.openxmlformats.org/wordprocessingml/2006/main" xmlns:w14="http://schemas.microsoft.com/office/word/2010/wordml" xmlns:w15="http://schemas.microsoft.com/office/word/2012/wordml" xmlns:w16se="http://schemas.microsoft.com/office/word/2015/wordml/symex" mc:Ignorable="w14 w15 w16se"/>
 </file>
 
 <file path=word/theme/theme1.xml><?xml version="1.0" encoding="utf-8"?>
@@ -9929,15 +9351,16 @@
 </file>
 
 <file path=customXml/item1.xml><?xml version="1.0" encoding="utf-8"?>
-<?mso-contentType ?>
-<FormTemplates xmlns="http://schemas.microsoft.com/sharepoint/v3/contenttype/forms">
-  <Display>DocumentLibraryForm</Display>
-  <Edit>DocumentLibraryForm</Edit>
-  <New>DocumentLibraryForm</New>
-</FormTemplates>
+<b:Sources xmlns:b="http://schemas.openxmlformats.org/officeDocument/2006/bibliography" xmlns="http://schemas.openxmlformats.org/officeDocument/2006/bibliography" SelectedStyle="\APASixthEditionOfficeOnline.xsl" StyleName="APA" Version="6"/>
 </file>
 
 <file path=customXml/item2.xml><?xml version="1.0" encoding="utf-8"?>
+<p:properties xmlns:p="http://schemas.microsoft.com/office/2006/metadata/properties" xmlns:xsi="http://www.w3.org/2001/XMLSchema-instance" xmlns:pc="http://schemas.microsoft.com/office/infopath/2007/PartnerControls">
+  <documentManagement/>
+</p:properties>
+</file>
+
+<file path=customXml/item3.xml><?xml version="1.0" encoding="utf-8"?>
 <ct:contentTypeSchema xmlns:ct="http://schemas.microsoft.com/office/2006/metadata/contentType" xmlns:ma="http://schemas.microsoft.com/office/2006/metadata/properties/metaAttributes" ct:_="" ma:_="" ma:contentTypeName="Documento" ma:contentTypeID="0x010100E96778489EE7714D8BD12CC105EB918B" ma:contentTypeVersion="2" ma:contentTypeDescription="Crear nuevo documento." ma:contentTypeScope="" ma:versionID="416c5c7ae9b5d54d83875cd3c65194e3">
   <xsd:schema xmlns:xsd="http://www.w3.org/2001/XMLSchema" xmlns:xs="http://www.w3.org/2001/XMLSchema" xmlns:p="http://schemas.microsoft.com/office/2006/metadata/properties" xmlns:ns2="126e8a1c-9ea9-435a-ac89-d06c80d62e30" targetNamespace="http://schemas.microsoft.com/office/2006/metadata/properties" ma:root="true" ma:fieldsID="70a237c842677bd850644f8595079f5e" ns2:_="">
     <xsd:import namespace="126e8a1c-9ea9-435a-ac89-d06c80d62e30"/>
@@ -10069,25 +9492,33 @@
 </ct:contentTypeSchema>
 </file>
 
-<file path=customXml/item3.xml><?xml version="1.0" encoding="utf-8"?>
-<p:properties xmlns:p="http://schemas.microsoft.com/office/2006/metadata/properties" xmlns:xsi="http://www.w3.org/2001/XMLSchema-instance" xmlns:pc="http://schemas.microsoft.com/office/infopath/2007/PartnerControls">
-  <documentManagement/>
-</p:properties>
-</file>
-
 <file path=customXml/item4.xml><?xml version="1.0" encoding="utf-8"?>
-<b:Sources xmlns:b="http://schemas.openxmlformats.org/officeDocument/2006/bibliography" xmlns="http://schemas.openxmlformats.org/officeDocument/2006/bibliography" SelectedStyle="\APASixthEditionOfficeOnline.xsl" StyleName="APA" Version="6"/>
+<?mso-contentType ?>
+<FormTemplates xmlns="http://schemas.microsoft.com/sharepoint/v3/contenttype/forms">
+  <Display>DocumentLibraryForm</Display>
+  <Edit>DocumentLibraryForm</Edit>
+  <New>DocumentLibraryForm</New>
+</FormTemplates>
 </file>
 
 <file path=customXml/itemProps1.xml><?xml version="1.0" encoding="utf-8"?>
-<ds:datastoreItem xmlns:ds="http://schemas.openxmlformats.org/officeDocument/2006/customXml" ds:itemID="{DABAA964-10BA-4DBC-ABF2-CDEAC0FAF7AA}">
+<ds:datastoreItem xmlns:ds="http://schemas.openxmlformats.org/officeDocument/2006/customXml" ds:itemID="{38798A93-35BB-4E36-97F5-7254B21EAFCC}">
   <ds:schemaRefs>
-    <ds:schemaRef ds:uri="http://schemas.microsoft.com/sharepoint/v3/contenttype/forms"/>
+    <ds:schemaRef ds:uri="http://schemas.openxmlformats.org/officeDocument/2006/bibliography"/>
   </ds:schemaRefs>
 </ds:datastoreItem>
 </file>
 
 <file path=customXml/itemProps2.xml><?xml version="1.0" encoding="utf-8"?>
+<ds:datastoreItem xmlns:ds="http://schemas.openxmlformats.org/officeDocument/2006/customXml" ds:itemID="{5F1783E3-BA1C-4CA3-8E32-C9B378BBED03}">
+  <ds:schemaRefs>
+    <ds:schemaRef ds:uri="http://schemas.microsoft.com/office/2006/metadata/properties"/>
+    <ds:schemaRef ds:uri="http://schemas.microsoft.com/office/infopath/2007/PartnerControls"/>
+  </ds:schemaRefs>
+</ds:datastoreItem>
+</file>
+
+<file path=customXml/itemProps3.xml><?xml version="1.0" encoding="utf-8"?>
 <ds:datastoreItem xmlns:ds="http://schemas.openxmlformats.org/officeDocument/2006/customXml" ds:itemID="{90673534-9590-47F8-B0D6-46AB217CB3AD}">
   <ds:schemaRefs>
     <ds:schemaRef ds:uri="http://schemas.microsoft.com/office/2006/metadata/contentType"/>
@@ -10105,26 +9536,10 @@
 </ds:datastoreItem>
 </file>
 
-<file path=customXml/itemProps3.xml><?xml version="1.0" encoding="utf-8"?>
-<ds:datastoreItem xmlns:ds="http://schemas.openxmlformats.org/officeDocument/2006/customXml" ds:itemID="{5F1783E3-BA1C-4CA3-8E32-C9B378BBED03}">
+<file path=customXml/itemProps4.xml><?xml version="1.0" encoding="utf-8"?>
+<ds:datastoreItem xmlns:ds="http://schemas.openxmlformats.org/officeDocument/2006/customXml" ds:itemID="{DABAA964-10BA-4DBC-ABF2-CDEAC0FAF7AA}">
   <ds:schemaRefs>
-    <ds:schemaRef ds:uri="http://purl.org/dc/terms/"/>
-    <ds:schemaRef ds:uri="http://purl.org/dc/dcmitype/"/>
-    <ds:schemaRef ds:uri="http://schemas.microsoft.com/office/2006/metadata/properties"/>
-    <ds:schemaRef ds:uri="http://www.w3.org/XML/1998/namespace"/>
-    <ds:schemaRef ds:uri="http://schemas.microsoft.com/office/2006/documentManagement/types"/>
-    <ds:schemaRef ds:uri="126e8a1c-9ea9-435a-ac89-d06c80d62e30"/>
-    <ds:schemaRef ds:uri="http://purl.org/dc/elements/1.1/"/>
-    <ds:schemaRef ds:uri="http://schemas.microsoft.com/office/infopath/2007/PartnerControls"/>
-    <ds:schemaRef ds:uri="http://schemas.openxmlformats.org/package/2006/metadata/core-properties"/>
-  </ds:schemaRefs>
-</ds:datastoreItem>
-</file>
-
-<file path=customXml/itemProps4.xml><?xml version="1.0" encoding="utf-8"?>
-<ds:datastoreItem xmlns:ds="http://schemas.openxmlformats.org/officeDocument/2006/customXml" ds:itemID="{38798A93-35BB-4E36-97F5-7254B21EAFCC}">
-  <ds:schemaRefs>
-    <ds:schemaRef ds:uri="http://schemas.openxmlformats.org/officeDocument/2006/bibliography"/>
+    <ds:schemaRef ds:uri="http://schemas.microsoft.com/sharepoint/v3/contenttype/forms"/>
   </ds:schemaRefs>
 </ds:datastoreItem>
 </file>
</xml_diff>